<commit_message>
test rate limit bypass
</commit_message>
<xml_diff>
--- a/docs/Dissertation_Ganesh_oli.docx
+++ b/docs/Dissertation_Ganesh_oli.docx
@@ -1,6 +1,6 @@
 
 <file path=word/document.xml><?xml version="1.0" encoding="utf-8"?>
-<w:document xmlns:wpc="http://schemas.microsoft.com/office/word/2010/wordprocessingCanvas" xmlns:cx="http://schemas.microsoft.com/office/drawing/2014/chartex" xmlns:cx1="http://schemas.microsoft.com/office/drawing/2015/9/8/chartex" xmlns:cx2="http://schemas.microsoft.com/office/drawing/2015/10/21/chartex" xmlns:cx3="http://schemas.microsoft.com/office/drawing/2016/5/9/chartex" xmlns:cx4="http://schemas.microsoft.com/office/drawing/2016/5/10/chartex" xmlns:cx5="http://schemas.microsoft.com/office/drawing/2016/5/11/chartex" xmlns:cx6="http://schemas.microsoft.com/office/drawing/2016/5/12/chartex" xmlns:cx7="http://schemas.microsoft.com/office/drawing/2016/5/13/chartex" xmlns:cx8="http://schemas.microsoft.com/office/drawing/2016/5/14/chartex" xmlns:mc="http://schemas.openxmlformats.org/markup-compatibility/2006" xmlns:aink="http://schemas.microsoft.com/office/drawing/2016/ink" xmlns:am3d="http://schemas.microsoft.com/office/drawing/2017/model3d" xmlns:o="urn:schemas-microsoft-com:office:office" xmlns:oel="http://schemas.microsoft.com/office/2019/extlst" xmlns:r="http://schemas.openxmlformats.org/officeDocument/2006/relationships" xmlns:m="http://schemas.openxmlformats.org/officeDocument/2006/math" xmlns:v="urn:schemas-microsoft-com:vml" xmlns:wp14="http://schemas.microsoft.com/office/word/2010/wordprocessingDrawing" xmlns:wp="http://schemas.openxmlformats.org/drawingml/2006/wordprocessingDrawing" xmlns:w10="urn:schemas-microsoft-com:office:word" xmlns:w="http://schemas.openxmlformats.org/wordprocessingml/2006/main" xmlns:w14="http://schemas.microsoft.com/office/word/2010/wordml" xmlns:w15="http://schemas.microsoft.com/office/word/2012/wordml" xmlns:w16cex="http://schemas.microsoft.com/office/word/2018/wordml/cex" xmlns:w16cid="http://schemas.microsoft.com/office/word/2016/wordml/cid" xmlns:w16="http://schemas.microsoft.com/office/word/2018/wordml" xmlns:w16du="http://schemas.microsoft.com/office/word/2023/wordml/word16du" xmlns:w16sdtdh="http://schemas.microsoft.com/office/word/2020/wordml/sdtdatahash" xmlns:w16sdtfl="http://schemas.microsoft.com/office/word/2024/wordml/sdtformatlock" xmlns:w16se="http://schemas.microsoft.com/office/word/2015/wordml/symex" xmlns:wpg="http://schemas.microsoft.com/office/word/2010/wordprocessingGroup" xmlns:wpi="http://schemas.microsoft.com/office/word/2010/wordprocessingInk" xmlns:wne="http://schemas.microsoft.com/office/word/2006/wordml" xmlns:wps="http://schemas.microsoft.com/office/word/2010/wordprocessingShape" mc:Ignorable="w14 w15 w16se w16cid w16 w16cex w16sdtdh w16sdtfl w16du wp14">
+<w:document xmlns:wpc="http://schemas.microsoft.com/office/word/2010/wordprocessingCanvas" xmlns:cx="http://schemas.microsoft.com/office/drawing/2014/chartex" xmlns:cx1="http://schemas.microsoft.com/office/drawing/2015/9/8/chartex" xmlns:cx2="http://schemas.microsoft.com/office/drawing/2015/10/21/chartex" xmlns:cx3="http://schemas.microsoft.com/office/drawing/2016/5/9/chartex" xmlns:cx4="http://schemas.microsoft.com/office/drawing/2016/5/10/chartex" xmlns:cx5="http://schemas.microsoft.com/office/drawing/2016/5/11/chartex" xmlns:cx6="http://schemas.microsoft.com/office/drawing/2016/5/12/chartex" xmlns:cx7="http://schemas.microsoft.com/office/drawing/2016/5/13/chartex" xmlns:cx8="http://schemas.microsoft.com/office/drawing/2016/5/14/chartex" xmlns:mc="http://schemas.openxmlformats.org/markup-compatibility/2006" xmlns:m="http://schemas.openxmlformats.org/officeDocument/2006/math" xmlns:aink="http://schemas.microsoft.com/office/drawing/2016/ink" xmlns:am3d="http://schemas.microsoft.com/office/drawing/2017/model3d" xmlns:oel="http://schemas.microsoft.com/office/2019/extlst" xmlns:r="http://schemas.openxmlformats.org/officeDocument/2006/relationships" xmlns:wp14="http://schemas.microsoft.com/office/word/2010/wordprocessingDrawing" xmlns:wp="http://schemas.openxmlformats.org/drawingml/2006/wordprocessingDrawing" xmlns:wpg="http://schemas.microsoft.com/office/word/2010/wordprocessingGroup" xmlns:wpi="http://schemas.microsoft.com/office/word/2010/wordprocessingInk" xmlns:wps="http://schemas.microsoft.com/office/word/2010/wordprocessingShape" xmlns:o="urn:schemas-microsoft-com:office:office" xmlns:v="urn:schemas-microsoft-com:vml" xmlns:w10="urn:schemas-microsoft-com:office:word" xmlns:w="http://schemas.openxmlformats.org/wordprocessingml/2006/main" xmlns:w14="http://schemas.microsoft.com/office/word/2010/wordml" xmlns:w15="http://schemas.microsoft.com/office/word/2012/wordml" xmlns:w16cei="http://schemas.microsoft.com/office/word/2026/wordml/cei" xmlns:w16cex="http://schemas.microsoft.com/office/word/2018/wordml/cex" xmlns:w16cid="http://schemas.microsoft.com/office/word/2016/wordml/cid" xmlns:w16="http://schemas.microsoft.com/office/word/2018/wordml" xmlns:w16sdtdh="http://schemas.microsoft.com/office/word/2020/wordml/sdtdatahash" xmlns:w16sdtfl="http://schemas.microsoft.com/office/word/2024/wordml/sdtformatlock" xmlns:w16se="http://schemas.microsoft.com/office/word/2015/wordml/symex" xmlns:w16du="http://schemas.microsoft.com/office/word/2023/wordml/word16du" xmlns:wne="http://schemas.microsoft.com/office/word/2006/wordml" mc:Ignorable="w14 w15 w16se w16cid w16 w16cex w16sdtdh w16sdtfl w16du wp14">
   <w:body>
     <w:p>
       <w:pPr>
@@ -7310,12 +7310,9 @@
       <w:pPr>
         <w:pStyle w:val="Heading1"/>
       </w:pPr>
+      <w:bookmarkStart w:id="30" w:name="_Toc128143303"/>
       <w:r>
         <w:lastRenderedPageBreak/>
-        <w:br/>
-      </w:r>
-      <w:bookmarkStart w:id="30" w:name="_Toc128143303"/>
-      <w:r>
         <w:t>Methodology</w:t>
       </w:r>
       <w:bookmarkEnd w:id="26"/>
@@ -7335,28 +7332,7 @@
           <w:rFonts w:eastAsiaTheme="minorEastAsia"/>
           <w:color w:val="000000" w:themeColor="text1"/>
         </w:rPr>
-        <w:t xml:space="preserve">This </w:t>
-      </w:r>
-      <w:r>
-        <w:rPr>
-          <w:rFonts w:eastAsiaTheme="minorEastAsia"/>
-          <w:color w:val="000000" w:themeColor="text1"/>
-        </w:rPr>
-        <w:t>chapter</w:t>
-      </w:r>
-      <w:r>
-        <w:rPr>
-          <w:rFonts w:eastAsiaTheme="minorEastAsia"/>
-          <w:color w:val="000000" w:themeColor="text1"/>
-        </w:rPr>
-        <w:t xml:space="preserve"> describes the proposed system's architecture, data collection, preprocessing, feature extraction and selection, model development, performance evaluation metrics, and implementation details.</w:t>
-      </w:r>
-      <w:r>
-        <w:rPr>
-          <w:rFonts w:eastAsiaTheme="minorEastAsia"/>
-          <w:color w:val="000000" w:themeColor="text1"/>
-        </w:rPr>
-        <w:t xml:space="preserve"> </w:t>
+        <w:t>Chapter 2 showed that the parts of the problem having been solved separately. Smart contracts can record claims in a way that cannot be altered, machine-learning models can spot fraudulent claims with good accuracy, and distributed cloud pipelines can move large volumes of data quickly. What is missing is an architecture that joins them together and is then tested properly. This chapter explains how the architecture will be designed, built and evaluated. It covers the overall system design, how the data will be collected and prepared, how features will be extracted, which models will be developed, how performance will be measured, and what tools will be used to implement everything.</w:t>
       </w:r>
     </w:p>
     <w:p>
@@ -7368,21 +7344,9 @@
           <w:color w:val="000000" w:themeColor="text1"/>
         </w:rPr>
       </w:pPr>
-      <w:r>
-        <w:rPr>
-          <w:rFonts w:eastAsiaTheme="minorEastAsia"/>
-          <w:color w:val="000000" w:themeColor="text1"/>
-        </w:rPr>
-        <w:t xml:space="preserve">It is recommended to provide an end-to-end model pipeline in a block diagram with all the necessary components shown in the Figure 3.1. </w:t>
-      </w:r>
-    </w:p>
-    <w:p>
-      <w:pPr>
-        <w:pStyle w:val="ListParagraph"/>
-        <w:numPr>
-          <w:ilvl w:val="0"/>
-          <w:numId w:val="4"/>
-        </w:numPr>
+    </w:p>
+    <w:p>
+      <w:pPr>
         <w:spacing w:line="360" w:lineRule="auto"/>
         <w:jc w:val="both"/>
         <w:rPr>
@@ -7395,23 +7359,247 @@
           <w:rFonts w:eastAsiaTheme="minorEastAsia"/>
           <w:color w:val="000000" w:themeColor="text1"/>
         </w:rPr>
-        <w:t>D</w:t>
-      </w:r>
-      <w:r>
-        <w:rPr>
-          <w:rFonts w:eastAsiaTheme="minorEastAsia"/>
-          <w:color w:val="000000" w:themeColor="text1"/>
-        </w:rPr>
-        <w:t>ata collection and preprocessing methods</w:t>
-      </w:r>
-    </w:p>
-    <w:p>
-      <w:pPr>
-        <w:pStyle w:val="ListParagraph"/>
-        <w:numPr>
-          <w:ilvl w:val="0"/>
-          <w:numId w:val="4"/>
-        </w:numPr>
+        <w:t xml:space="preserve">The design follows one guiding principle: each layer should do the job it is good at. Distributed ledgers are built for integrity and agreement between parties, not for fast analytical queries, and both storage space and transaction throughput on a public chain are limited </w:t>
+      </w:r>
+      <w:sdt>
+        <w:sdtPr>
+          <w:rPr>
+            <w:rFonts w:eastAsiaTheme="minorEastAsia"/>
+            <w:color w:val="000000" w:themeColor="text1"/>
+          </w:rPr>
+          <w:id w:val="722712343"/>
+          <w:citation/>
+        </w:sdtPr>
+        <w:sdtContent>
+          <w:r>
+            <w:rPr>
+              <w:rFonts w:eastAsiaTheme="minorEastAsia"/>
+              <w:color w:val="000000" w:themeColor="text1"/>
+            </w:rPr>
+            <w:fldChar w:fldCharType="begin"/>
+          </w:r>
+          <w:r>
+            <w:rPr>
+              <w:rFonts w:eastAsiaTheme="minorEastAsia"/>
+              <w:color w:val="000000" w:themeColor="text1"/>
+            </w:rPr>
+            <w:instrText xml:space="preserve"> CITATION Shu22 \l 1033  \m MaS241</w:instrText>
+          </w:r>
+          <w:r>
+            <w:rPr>
+              <w:rFonts w:eastAsiaTheme="minorEastAsia"/>
+              <w:color w:val="000000" w:themeColor="text1"/>
+            </w:rPr>
+            <w:fldChar w:fldCharType="separate"/>
+          </w:r>
+          <w:r>
+            <w:rPr>
+              <w:rFonts w:eastAsiaTheme="minorEastAsia"/>
+              <w:noProof/>
+              <w:color w:val="000000" w:themeColor="text1"/>
+            </w:rPr>
+            <w:t>(Shuaib, et al., 2022; Ma &amp; Zhang, 2024)</w:t>
+          </w:r>
+          <w:r>
+            <w:rPr>
+              <w:rFonts w:eastAsiaTheme="minorEastAsia"/>
+              <w:color w:val="000000" w:themeColor="text1"/>
+            </w:rPr>
+            <w:fldChar w:fldCharType="end"/>
+          </w:r>
+        </w:sdtContent>
+      </w:sdt>
+      <w:r>
+        <w:rPr>
+          <w:rFonts w:eastAsiaTheme="minorEastAsia"/>
+          <w:color w:val="000000" w:themeColor="text1"/>
+        </w:rPr>
+        <w:t xml:space="preserve">. Trying to run analytics on the chain itself would therefore be slow and expensive. For that reason, the ledger is used only to record compact, verifiable claim events, bulk documents are held off-chain in the </w:t>
+      </w:r>
+      <w:proofErr w:type="spellStart"/>
+      <w:r>
+        <w:rPr>
+          <w:rFonts w:eastAsiaTheme="minorEastAsia"/>
+          <w:color w:val="000000" w:themeColor="text1"/>
+        </w:rPr>
+        <w:t>InterPlanetary</w:t>
+      </w:r>
+      <w:proofErr w:type="spellEnd"/>
+      <w:r>
+        <w:rPr>
+          <w:rFonts w:eastAsiaTheme="minorEastAsia"/>
+          <w:color w:val="000000" w:themeColor="text1"/>
+        </w:rPr>
+        <w:t xml:space="preserve"> File System (IPFS) with a cryptographic reference stored on-chain, and all heavy transformation and model training happens in a cloud pipeline. This on-chain and off-chain split follows the pattern established by </w:t>
+      </w:r>
+      <w:sdt>
+        <w:sdtPr>
+          <w:rPr>
+            <w:rFonts w:eastAsiaTheme="minorEastAsia"/>
+            <w:color w:val="000000" w:themeColor="text1"/>
+          </w:rPr>
+          <w:id w:val="-1459106827"/>
+          <w:citation/>
+        </w:sdtPr>
+        <w:sdtContent>
+          <w:r>
+            <w:rPr>
+              <w:rFonts w:eastAsiaTheme="minorEastAsia"/>
+              <w:color w:val="000000" w:themeColor="text1"/>
+            </w:rPr>
+            <w:fldChar w:fldCharType="begin"/>
+          </w:r>
+          <w:r>
+            <w:rPr>
+              <w:rFonts w:eastAsiaTheme="minorEastAsia"/>
+              <w:color w:val="000000" w:themeColor="text1"/>
+            </w:rPr>
+            <w:instrText xml:space="preserve"> CITATION Aln22 \l 1033 </w:instrText>
+          </w:r>
+          <w:r>
+            <w:rPr>
+              <w:rFonts w:eastAsiaTheme="minorEastAsia"/>
+              <w:color w:val="000000" w:themeColor="text1"/>
+            </w:rPr>
+            <w:fldChar w:fldCharType="separate"/>
+          </w:r>
+          <w:r>
+            <w:rPr>
+              <w:rFonts w:eastAsiaTheme="minorEastAsia"/>
+              <w:noProof/>
+              <w:color w:val="000000" w:themeColor="text1"/>
+            </w:rPr>
+            <w:t>(Alnuaimi, et al., 2022)</w:t>
+          </w:r>
+          <w:r>
+            <w:rPr>
+              <w:rFonts w:eastAsiaTheme="minorEastAsia"/>
+              <w:color w:val="000000" w:themeColor="text1"/>
+            </w:rPr>
+            <w:fldChar w:fldCharType="end"/>
+          </w:r>
+        </w:sdtContent>
+      </w:sdt>
+      <w:r>
+        <w:rPr>
+          <w:rFonts w:eastAsiaTheme="minorEastAsia"/>
+          <w:color w:val="000000" w:themeColor="text1"/>
+        </w:rPr>
+        <w:t xml:space="preserve"> and refined by </w:t>
+      </w:r>
+      <w:sdt>
+        <w:sdtPr>
+          <w:rPr>
+            <w:rFonts w:eastAsiaTheme="minorEastAsia"/>
+            <w:color w:val="000000" w:themeColor="text1"/>
+          </w:rPr>
+          <w:id w:val="-255128674"/>
+          <w:citation/>
+        </w:sdtPr>
+        <w:sdtContent>
+          <w:r>
+            <w:rPr>
+              <w:rFonts w:eastAsiaTheme="minorEastAsia"/>
+              <w:color w:val="000000" w:themeColor="text1"/>
+            </w:rPr>
+            <w:fldChar w:fldCharType="begin"/>
+          </w:r>
+          <w:r>
+            <w:rPr>
+              <w:rFonts w:eastAsiaTheme="minorEastAsia"/>
+              <w:color w:val="000000" w:themeColor="text1"/>
+            </w:rPr>
+            <w:instrText xml:space="preserve"> CITATION MaS24 \l 1033 </w:instrText>
+          </w:r>
+          <w:r>
+            <w:rPr>
+              <w:rFonts w:eastAsiaTheme="minorEastAsia"/>
+              <w:color w:val="000000" w:themeColor="text1"/>
+            </w:rPr>
+            <w:fldChar w:fldCharType="separate"/>
+          </w:r>
+          <w:r>
+            <w:rPr>
+              <w:rFonts w:eastAsiaTheme="minorEastAsia"/>
+              <w:noProof/>
+              <w:color w:val="000000" w:themeColor="text1"/>
+            </w:rPr>
+            <w:t>(Ma &amp; Zhang, 2024)</w:t>
+          </w:r>
+          <w:r>
+            <w:rPr>
+              <w:rFonts w:eastAsiaTheme="minorEastAsia"/>
+              <w:color w:val="000000" w:themeColor="text1"/>
+            </w:rPr>
+            <w:fldChar w:fldCharType="end"/>
+          </w:r>
+        </w:sdtContent>
+      </w:sdt>
+      <w:r>
+        <w:rPr>
+          <w:rFonts w:eastAsiaTheme="minorEastAsia"/>
+          <w:color w:val="000000" w:themeColor="text1"/>
+        </w:rPr>
+        <w:t xml:space="preserve">, and more recently applied to claims processing by </w:t>
+      </w:r>
+      <w:sdt>
+        <w:sdtPr>
+          <w:rPr>
+            <w:rFonts w:eastAsiaTheme="minorEastAsia"/>
+            <w:color w:val="000000" w:themeColor="text1"/>
+          </w:rPr>
+          <w:id w:val="-373153004"/>
+          <w:citation/>
+        </w:sdtPr>
+        <w:sdtContent>
+          <w:r>
+            <w:rPr>
+              <w:rFonts w:eastAsiaTheme="minorEastAsia"/>
+              <w:color w:val="000000" w:themeColor="text1"/>
+            </w:rPr>
+            <w:fldChar w:fldCharType="begin"/>
+          </w:r>
+          <w:r>
+            <w:rPr>
+              <w:rFonts w:eastAsiaTheme="minorEastAsia"/>
+              <w:color w:val="000000" w:themeColor="text1"/>
+            </w:rPr>
+            <w:instrText xml:space="preserve"> CITATION Isl25 \l 1033 </w:instrText>
+          </w:r>
+          <w:r>
+            <w:rPr>
+              <w:rFonts w:eastAsiaTheme="minorEastAsia"/>
+              <w:color w:val="000000" w:themeColor="text1"/>
+            </w:rPr>
+            <w:fldChar w:fldCharType="separate"/>
+          </w:r>
+          <w:r>
+            <w:rPr>
+              <w:rFonts w:eastAsiaTheme="minorEastAsia"/>
+              <w:noProof/>
+              <w:color w:val="000000" w:themeColor="text1"/>
+            </w:rPr>
+            <w:t>(Islayem, et al., 2025)</w:t>
+          </w:r>
+          <w:r>
+            <w:rPr>
+              <w:rFonts w:eastAsiaTheme="minorEastAsia"/>
+              <w:color w:val="000000" w:themeColor="text1"/>
+            </w:rPr>
+            <w:fldChar w:fldCharType="end"/>
+          </w:r>
+        </w:sdtContent>
+      </w:sdt>
+      <w:r>
+        <w:rPr>
+          <w:rFonts w:eastAsiaTheme="minorEastAsia"/>
+          <w:color w:val="000000" w:themeColor="text1"/>
+        </w:rPr>
+        <w:t>. Figure 3.1 shows the resulting end-to-end pipeline.</w:t>
+      </w:r>
+    </w:p>
+    <w:p>
+      <w:pPr>
         <w:spacing w:line="360" w:lineRule="auto"/>
         <w:jc w:val="both"/>
         <w:rPr>
@@ -7419,127 +7607,26 @@
           <w:color w:val="000000" w:themeColor="text1"/>
         </w:rPr>
       </w:pPr>
-      <w:r>
-        <w:rPr>
-          <w:rFonts w:eastAsiaTheme="minorEastAsia"/>
-          <w:color w:val="000000" w:themeColor="text1"/>
-        </w:rPr>
-        <w:t>Feature extraction</w:t>
-      </w:r>
-    </w:p>
-    <w:p>
-      <w:pPr>
-        <w:pStyle w:val="ListParagraph"/>
-        <w:numPr>
-          <w:ilvl w:val="0"/>
-          <w:numId w:val="4"/>
-        </w:numPr>
+    </w:p>
+    <w:p>
+      <w:pPr>
+        <w:keepNext/>
         <w:spacing w:line="360" w:lineRule="auto"/>
         <w:jc w:val="both"/>
-        <w:rPr>
-          <w:rFonts w:eastAsiaTheme="minorEastAsia"/>
-          <w:color w:val="000000" w:themeColor="text1"/>
-        </w:rPr>
-      </w:pPr>
-      <w:r>
-        <w:rPr>
-          <w:rFonts w:eastAsiaTheme="minorEastAsia"/>
-          <w:color w:val="000000" w:themeColor="text1"/>
-        </w:rPr>
-        <w:t>M</w:t>
-      </w:r>
-      <w:r>
-        <w:rPr>
-          <w:rFonts w:eastAsiaTheme="minorEastAsia"/>
-          <w:color w:val="000000" w:themeColor="text1"/>
-        </w:rPr>
-        <w:t>achine learning</w:t>
-      </w:r>
-      <w:r>
-        <w:rPr>
-          <w:rFonts w:eastAsiaTheme="minorEastAsia"/>
-          <w:color w:val="000000" w:themeColor="text1"/>
-        </w:rPr>
-        <w:t>/AL</w:t>
-      </w:r>
-      <w:r>
-        <w:rPr>
-          <w:rFonts w:eastAsiaTheme="minorEastAsia"/>
-          <w:color w:val="000000" w:themeColor="text1"/>
-        </w:rPr>
-        <w:t xml:space="preserve"> algorithms used for model development</w:t>
-      </w:r>
-    </w:p>
-    <w:p>
-      <w:pPr>
-        <w:pStyle w:val="ListParagraph"/>
-        <w:numPr>
-          <w:ilvl w:val="0"/>
-          <w:numId w:val="4"/>
-        </w:numPr>
-        <w:spacing w:line="360" w:lineRule="auto"/>
-        <w:jc w:val="both"/>
-        <w:rPr>
-          <w:rFonts w:eastAsiaTheme="minorEastAsia"/>
-          <w:color w:val="000000" w:themeColor="text1"/>
-        </w:rPr>
-      </w:pPr>
-      <w:r>
-        <w:rPr>
-          <w:rFonts w:eastAsiaTheme="minorEastAsia"/>
-          <w:color w:val="000000" w:themeColor="text1"/>
-        </w:rPr>
-        <w:t xml:space="preserve">Performance </w:t>
-      </w:r>
-      <w:r>
-        <w:rPr>
-          <w:rFonts w:eastAsiaTheme="minorEastAsia"/>
-          <w:color w:val="000000" w:themeColor="text1"/>
-        </w:rPr>
-        <w:t>evaluation metrics and methods</w:t>
-      </w:r>
-      <w:r>
-        <w:t xml:space="preserve"> </w:t>
-      </w:r>
-    </w:p>
-    <w:p>
-      <w:pPr>
-        <w:spacing w:line="360" w:lineRule="auto"/>
-        <w:jc w:val="both"/>
-        <w:rPr>
-          <w:rFonts w:eastAsiaTheme="minorEastAsia"/>
-          <w:color w:val="000000" w:themeColor="text1"/>
-        </w:rPr>
-      </w:pPr>
-      <w:r>
-        <w:rPr>
-          <w:rFonts w:eastAsiaTheme="minorEastAsia"/>
-          <w:color w:val="000000" w:themeColor="text1"/>
-        </w:rPr>
-        <w:t xml:space="preserve">After the figure, you should explain with reference each of the component of the proposed methodology. </w:t>
-      </w:r>
-    </w:p>
-    <w:p>
-      <w:pPr>
-        <w:spacing w:line="360" w:lineRule="auto"/>
-        <w:jc w:val="both"/>
-        <w:rPr>
-          <w:rFonts w:eastAsiaTheme="minorEastAsia"/>
-          <w:color w:val="000000" w:themeColor="text1"/>
-        </w:rPr>
       </w:pPr>
       <w:r>
         <w:rPr>
           <w:rFonts w:eastAsiaTheme="minorEastAsia"/>
           <w:noProof/>
           <w:color w:val="000000" w:themeColor="text1"/>
+          <w14:ligatures w14:val="standardContextual"/>
         </w:rPr>
         <w:lastRenderedPageBreak/>
         <w:drawing>
-          <wp:inline distT="0" distB="0" distL="0" distR="0" wp14:anchorId="5DD2B5F9" wp14:editId="779BF40F">
-            <wp:extent cx="5486400" cy="4796790"/>
-            <wp:effectExtent l="0" t="0" r="0" b="3810"/>
-            <wp:docPr id="3" name="Picture 3" descr="A picture containing text, diagram, plan, sketch&#10;&#10;Description automatically generated"/>
+          <wp:inline distT="0" distB="0" distL="0" distR="0" wp14:anchorId="7A3BD978" wp14:editId="733AEFF0">
+            <wp:extent cx="5486400" cy="5061585"/>
+            <wp:effectExtent l="0" t="0" r="0" b="5715"/>
+            <wp:docPr id="591651142" name="Picture 1"/>
             <wp:cNvGraphicFramePr>
               <a:graphicFrameLocks xmlns:a="http://schemas.openxmlformats.org/drawingml/2006/main" noChangeAspect="1"/>
             </wp:cNvGraphicFramePr>
@@ -7547,11 +7634,17 @@
               <a:graphicData uri="http://schemas.openxmlformats.org/drawingml/2006/picture">
                 <pic:pic xmlns:pic="http://schemas.openxmlformats.org/drawingml/2006/picture">
                   <pic:nvPicPr>
-                    <pic:cNvPr id="3" name="Picture 3" descr="A picture containing text, diagram, plan, sketch&#10;&#10;Description automatically generated"/>
+                    <pic:cNvPr id="591651142" name="Picture 591651142"/>
                     <pic:cNvPicPr/>
                   </pic:nvPicPr>
                   <pic:blipFill>
-                    <a:blip r:embed="rId10"/>
+                    <a:blip r:embed="rId10" cstate="print">
+                      <a:extLst>
+                        <a:ext uri="{28A0092B-C50C-407E-A947-70E740481C1C}">
+                          <a14:useLocalDpi xmlns:a14="http://schemas.microsoft.com/office/drawing/2010/main" val="0"/>
+                        </a:ext>
+                      </a:extLst>
+                    </a:blip>
                     <a:stretch>
                       <a:fillRect/>
                     </a:stretch>
@@ -7559,7 +7652,7 @@
                   <pic:spPr>
                     <a:xfrm>
                       <a:off x="0" y="0"/>
-                      <a:ext cx="5486400" cy="4796790"/>
+                      <a:ext cx="5486400" cy="5061585"/>
                     </a:xfrm>
                     <a:prstGeom prst="rect">
                       <a:avLst/>
@@ -7575,96 +7668,101 @@
     <w:p>
       <w:pPr>
         <w:pStyle w:val="Caption"/>
-      </w:pPr>
-      <w:bookmarkStart w:id="31" w:name="_Toc128143321"/>
+        <w:jc w:val="both"/>
+      </w:pPr>
       <w:r>
         <w:t xml:space="preserve">Figure </w:t>
       </w:r>
       <w:r>
-        <w:t>3</w:t>
-      </w:r>
-      <w:r>
-        <w:t>.</w:t>
-      </w:r>
-      <w:r>
         <w:fldChar w:fldCharType="begin"/>
       </w:r>
       <w:r>
-        <w:instrText xml:space="preserve"> SEQ Figure \* ARABIC \s 1 </w:instrText>
+        <w:instrText xml:space="preserve"> SEQ Figure \* ARABIC </w:instrText>
       </w:r>
       <w:r>
         <w:fldChar w:fldCharType="separate"/>
       </w:r>
       <w:r>
+        <w:rPr>
+          <w:noProof/>
+        </w:rPr>
         <w:t>1</w:t>
       </w:r>
       <w:r>
         <w:fldChar w:fldCharType="end"/>
       </w:r>
       <w:r>
-        <w:t xml:space="preserve"> Architecture of the proposed system</w:t>
-      </w:r>
-      <w:bookmarkEnd w:id="31"/>
-    </w:p>
-    <w:p>
-      <w:pPr>
-        <w:pStyle w:val="Heading2"/>
-        <w:rPr>
-          <w:lang w:val="en-US"/>
-        </w:rPr>
-      </w:pPr>
-      <w:bookmarkStart w:id="32" w:name="_Toc128056029"/>
-      <w:bookmarkStart w:id="33" w:name="_Toc128143304"/>
-      <w:r>
-        <w:rPr>
-          <w:lang w:val="en-US"/>
-        </w:rPr>
-        <w:t xml:space="preserve">Data </w:t>
-      </w:r>
-      <w:r>
-        <w:rPr>
-          <w:lang w:val="en-US"/>
-        </w:rPr>
-        <w:t>C</w:t>
-      </w:r>
-      <w:r>
-        <w:rPr>
-          <w:lang w:val="en-US"/>
-        </w:rPr>
-        <w:t>ollection</w:t>
-      </w:r>
-      <w:r>
-        <w:rPr>
-          <w:lang w:val="en-US"/>
-        </w:rPr>
-        <w:t xml:space="preserve"> and Preprocessing</w:t>
-      </w:r>
-      <w:bookmarkEnd w:id="32"/>
-      <w:bookmarkEnd w:id="33"/>
-    </w:p>
+        <w:t>: Architecture of the proposed system</w:t>
+      </w:r>
+    </w:p>
+    <w:p/>
     <w:p>
       <w:pPr>
         <w:spacing w:line="360" w:lineRule="auto"/>
         <w:jc w:val="both"/>
-        <w:rPr>
-          <w:rFonts w:eastAsiaTheme="minorEastAsia"/>
-          <w:color w:val="000000" w:themeColor="text1"/>
-        </w:rPr>
-      </w:pPr>
-      <w:r>
-        <w:rPr>
-          <w:rFonts w:eastAsiaTheme="minorEastAsia"/>
-          <w:color w:val="000000" w:themeColor="text1"/>
-        </w:rPr>
-        <w:t>Describe the data collection and preprocessing methods</w:t>
-      </w:r>
-    </w:p>
-    <w:p>
-      <w:pPr>
-        <w:rPr>
-          <w:color w:val="4472C4" w:themeColor="accent1"/>
-        </w:rPr>
-      </w:pPr>
+      </w:pPr>
+      <w:r>
+        <w:t xml:space="preserve">The figure reads from top to bottom in four stages. A claim is first submitted through a decentralized application. In stage one it is written to the </w:t>
+      </w:r>
+      <w:proofErr w:type="spellStart"/>
+      <w:r>
+        <w:t>ClaimRegistry</w:t>
+      </w:r>
+      <w:proofErr w:type="spellEnd"/>
+      <w:r>
+        <w:t xml:space="preserve"> smart contract deployed on the Ethereum </w:t>
+      </w:r>
+      <w:proofErr w:type="spellStart"/>
+      <w:r>
+        <w:t>Sepolia</w:t>
+      </w:r>
+      <w:proofErr w:type="spellEnd"/>
+      <w:r>
+        <w:t xml:space="preserve"> test network, which stores a compact record. A hash of the claim, the IPFS content identifier for any supporting documents, the block timestamp and the submitting address and emits an event announcing that a claim has arrived. In stage two a listener serving running on Google Cloud picks up that event, passes it into a message queue, and a distributed processing job cleans the data, checks that the documents still match their on-chain hash, and turns the result into model-ready features held in a data warehouse. Stage three trains and applies the fraud-detection model on those features. </w:t>
+      </w:r>
+      <w:r>
+        <w:lastRenderedPageBreak/>
+        <w:t>Stage four evaluates the whole thing twice over: once on how well it detects fraud, and once on how well it performs as a system. Each stage is explained in more details below.</w:t>
+      </w:r>
+      <w:r>
+        <w:t xml:space="preserve"> </w:t>
+      </w:r>
+    </w:p>
+    <w:p>
+      <w:pPr>
+        <w:pStyle w:val="Heading2"/>
+        <w:rPr>
+          <w:lang w:val="en-US"/>
+        </w:rPr>
+      </w:pPr>
+      <w:bookmarkStart w:id="31" w:name="_Toc128056029"/>
+      <w:bookmarkStart w:id="32" w:name="_Toc128143304"/>
+      <w:r>
+        <w:rPr>
+          <w:lang w:val="en-US"/>
+        </w:rPr>
+        <w:t xml:space="preserve">Data </w:t>
+      </w:r>
+      <w:r>
+        <w:rPr>
+          <w:lang w:val="en-US"/>
+        </w:rPr>
+        <w:t>C</w:t>
+      </w:r>
+      <w:r>
+        <w:rPr>
+          <w:lang w:val="en-US"/>
+        </w:rPr>
+        <w:t>ollection</w:t>
+      </w:r>
+      <w:r>
+        <w:rPr>
+          <w:lang w:val="en-US"/>
+        </w:rPr>
+        <w:t xml:space="preserve"> and Preprocessing</w:t>
+      </w:r>
+      <w:bookmarkEnd w:id="31"/>
+      <w:bookmarkEnd w:id="32"/>
     </w:p>
     <w:p>
       <w:pPr>
@@ -7678,9 +7776,18 @@
       <w:r>
         <w:rPr>
           <w:rFonts w:eastAsiaTheme="minorEastAsia"/>
-          <w:color w:val="000000" w:themeColor="text1"/>
-        </w:rPr>
-        <w:t>Example:</w:t>
+          <w:b/>
+          <w:bCs/>
+          <w:color w:val="000000" w:themeColor="text1"/>
+        </w:rPr>
+        <w:t xml:space="preserve">Data collection. </w:t>
+      </w:r>
+      <w:r>
+        <w:rPr>
+          <w:rFonts w:eastAsiaTheme="minorEastAsia"/>
+          <w:color w:val="000000" w:themeColor="text1"/>
+        </w:rPr>
+        <w:t>Two different kinds of data are needed, and they come from two different place.</w:t>
       </w:r>
     </w:p>
     <w:p>
@@ -7692,22 +7799,6 @@
           <w:color w:val="000000" w:themeColor="text1"/>
         </w:rPr>
       </w:pPr>
-      <w:r>
-        <w:rPr>
-          <w:rFonts w:eastAsiaTheme="minorEastAsia"/>
-          <w:b/>
-          <w:bCs/>
-          <w:color w:val="000000" w:themeColor="text1"/>
-        </w:rPr>
-        <w:t>Data collection:</w:t>
-      </w:r>
-      <w:r>
-        <w:rPr>
-          <w:rFonts w:eastAsiaTheme="minorEastAsia"/>
-          <w:color w:val="000000" w:themeColor="text1"/>
-        </w:rPr>
-        <w:t xml:space="preserve"> Patient data will be collected from multiple sources, including electronic health records, medical imaging, and patient-generated data such as wearable devices and mobile apps.</w:t>
-      </w:r>
     </w:p>
     <w:p>
       <w:pPr>
@@ -7723,23 +7814,186 @@
           <w:rFonts w:eastAsiaTheme="minorEastAsia"/>
           <w:color w:val="000000" w:themeColor="text1"/>
         </w:rPr>
-        <w:t xml:space="preserve">If you are using </w:t>
-      </w:r>
-      <w:proofErr w:type="gramStart"/>
-      <w:r>
-        <w:rPr>
-          <w:rFonts w:eastAsiaTheme="minorEastAsia"/>
-          <w:color w:val="000000" w:themeColor="text1"/>
-        </w:rPr>
-        <w:t>open source</w:t>
-      </w:r>
-      <w:proofErr w:type="gramEnd"/>
-      <w:r>
-        <w:rPr>
-          <w:rFonts w:eastAsiaTheme="minorEastAsia"/>
-          <w:color w:val="000000" w:themeColor="text1"/>
-        </w:rPr>
-        <w:t xml:space="preserve"> dataset, describe the dataset to understand what feature the dataset has and how they are going to be ingest by the model</w:t>
+        <w:t xml:space="preserve">The first is labelled claim data with a known fraud outcome, which is what </w:t>
+      </w:r>
+      <w:r>
+        <w:rPr>
+          <w:rFonts w:eastAsiaTheme="minorEastAsia"/>
+          <w:color w:val="000000" w:themeColor="text1"/>
+        </w:rPr>
+        <w:t xml:space="preserve">any supervised model has to learn from. A publicly available automobile-insurance fraud dataset from Kaggle will be used for this purpose. Automobile insurance was chosen deliberately. </w:t>
+      </w:r>
+      <w:sdt>
+        <w:sdtPr>
+          <w:rPr>
+            <w:rFonts w:eastAsiaTheme="minorEastAsia"/>
+            <w:color w:val="000000" w:themeColor="text1"/>
+          </w:rPr>
+          <w:id w:val="434721374"/>
+          <w:citation/>
+        </w:sdtPr>
+        <w:sdtContent>
+          <w:r>
+            <w:rPr>
+              <w:rFonts w:eastAsiaTheme="minorEastAsia"/>
+              <w:color w:val="000000" w:themeColor="text1"/>
+            </w:rPr>
+            <w:fldChar w:fldCharType="begin"/>
+          </w:r>
+          <w:r>
+            <w:rPr>
+              <w:rFonts w:eastAsiaTheme="minorEastAsia"/>
+              <w:color w:val="000000" w:themeColor="text1"/>
+            </w:rPr>
+            <w:instrText xml:space="preserve"> CITATION Sch24 \l 1033 </w:instrText>
+          </w:r>
+          <w:r>
+            <w:rPr>
+              <w:rFonts w:eastAsiaTheme="minorEastAsia"/>
+              <w:color w:val="000000" w:themeColor="text1"/>
+            </w:rPr>
+            <w:fldChar w:fldCharType="separate"/>
+          </w:r>
+          <w:r>
+            <w:rPr>
+              <w:rFonts w:eastAsiaTheme="minorEastAsia"/>
+              <w:noProof/>
+              <w:color w:val="000000" w:themeColor="text1"/>
+            </w:rPr>
+            <w:t>(Schrijver, et al., 2024)</w:t>
+          </w:r>
+          <w:r>
+            <w:rPr>
+              <w:rFonts w:eastAsiaTheme="minorEastAsia"/>
+              <w:color w:val="000000" w:themeColor="text1"/>
+            </w:rPr>
+            <w:fldChar w:fldCharType="end"/>
+          </w:r>
+        </w:sdtContent>
+      </w:sdt>
+      <w:r>
+        <w:rPr>
+          <w:rFonts w:eastAsiaTheme="minorEastAsia"/>
+          <w:color w:val="000000" w:themeColor="text1"/>
+        </w:rPr>
+        <w:t xml:space="preserve"> in a systematic review of fifty studies on automobile insurance fraud, report that this line of business is the most heavily studied and that researchers repeatedly rely on the same small number of public datasets, largely because insurers rarely release real claim files. Using one of those well-known datasets is therefore not a compromise but an advantage: it means the results here can be compared against published work, including </w:t>
+      </w:r>
+      <w:sdt>
+        <w:sdtPr>
+          <w:rPr>
+            <w:rFonts w:eastAsiaTheme="minorEastAsia"/>
+            <w:color w:val="000000" w:themeColor="text1"/>
+          </w:rPr>
+          <w:id w:val="-1405525022"/>
+          <w:citation/>
+        </w:sdtPr>
+        <w:sdtContent>
+          <w:r>
+            <w:rPr>
+              <w:rFonts w:eastAsiaTheme="minorEastAsia"/>
+              <w:color w:val="000000" w:themeColor="text1"/>
+            </w:rPr>
+            <w:fldChar w:fldCharType="begin"/>
+          </w:r>
+          <w:r>
+            <w:rPr>
+              <w:rFonts w:eastAsiaTheme="minorEastAsia"/>
+              <w:color w:val="000000" w:themeColor="text1"/>
+            </w:rPr>
+            <w:instrText xml:space="preserve"> CITATION Öza25 \l 1033 </w:instrText>
+          </w:r>
+          <w:r>
+            <w:rPr>
+              <w:rFonts w:eastAsiaTheme="minorEastAsia"/>
+              <w:color w:val="000000" w:themeColor="text1"/>
+            </w:rPr>
+            <w:fldChar w:fldCharType="separate"/>
+          </w:r>
+          <w:r>
+            <w:rPr>
+              <w:rFonts w:eastAsiaTheme="minorEastAsia"/>
+              <w:noProof/>
+              <w:color w:val="000000" w:themeColor="text1"/>
+            </w:rPr>
+            <w:t>(Özaltın &amp; Karadağ Erdemir, 2025)</w:t>
+          </w:r>
+          <w:r>
+            <w:rPr>
+              <w:rFonts w:eastAsiaTheme="minorEastAsia"/>
+              <w:color w:val="000000" w:themeColor="text1"/>
+            </w:rPr>
+            <w:fldChar w:fldCharType="end"/>
+          </w:r>
+        </w:sdtContent>
+      </w:sdt>
+      <w:r>
+        <w:rPr>
+          <w:rFonts w:eastAsiaTheme="minorEastAsia"/>
+          <w:color w:val="000000" w:themeColor="text1"/>
+        </w:rPr>
+        <w:t xml:space="preserve"> and </w:t>
+      </w:r>
+      <w:sdt>
+        <w:sdtPr>
+          <w:rPr>
+            <w:rFonts w:eastAsiaTheme="minorEastAsia"/>
+            <w:color w:val="000000" w:themeColor="text1"/>
+          </w:rPr>
+          <w:id w:val="2146232327"/>
+          <w:citation/>
+        </w:sdtPr>
+        <w:sdtContent>
+          <w:r>
+            <w:rPr>
+              <w:rFonts w:eastAsiaTheme="minorEastAsia"/>
+              <w:color w:val="000000" w:themeColor="text1"/>
+            </w:rPr>
+            <w:fldChar w:fldCharType="begin"/>
+          </w:r>
+          <w:r>
+            <w:rPr>
+              <w:rFonts w:eastAsiaTheme="minorEastAsia"/>
+              <w:color w:val="000000" w:themeColor="text1"/>
+            </w:rPr>
+            <w:instrText xml:space="preserve"> CITATION Min24 \l 1033 </w:instrText>
+          </w:r>
+          <w:r>
+            <w:rPr>
+              <w:rFonts w:eastAsiaTheme="minorEastAsia"/>
+              <w:color w:val="000000" w:themeColor="text1"/>
+            </w:rPr>
+            <w:fldChar w:fldCharType="separate"/>
+          </w:r>
+          <w:r>
+            <w:rPr>
+              <w:rFonts w:eastAsiaTheme="minorEastAsia"/>
+              <w:noProof/>
+              <w:color w:val="000000" w:themeColor="text1"/>
+            </w:rPr>
+            <w:t>(Ming, et al., 2024)</w:t>
+          </w:r>
+          <w:r>
+            <w:rPr>
+              <w:rFonts w:eastAsiaTheme="minorEastAsia"/>
+              <w:color w:val="000000" w:themeColor="text1"/>
+            </w:rPr>
+            <w:fldChar w:fldCharType="end"/>
+          </w:r>
+        </w:sdtContent>
+      </w:sdt>
+      <w:r>
+        <w:rPr>
+          <w:rFonts w:eastAsiaTheme="minorEastAsia"/>
+          <w:color w:val="000000" w:themeColor="text1"/>
+        </w:rPr>
+        <w:t xml:space="preserve">, who both evaluate models on public automobile-claims data. The dataset contains the kinds of attributes an insurer would hold at claim time: policyholder details, policy and vehicle characteristics, the circumstances of the accident, how the claim was handled, and a binary </w:t>
+      </w:r>
+      <w:r>
+        <w:rPr>
+          <w:rFonts w:eastAsiaTheme="minorEastAsia"/>
+          <w:color w:val="000000" w:themeColor="text1"/>
+        </w:rPr>
+        <w:t>label indicating whether the claim was found to be fraudulent. The exact number of records, the number of attributes and the precise proportion of fraudulent cases will be reported in Chapter 4 from the downloaded copy of the dataset, since versions published on Kaggle vary and figures should be taken from the file used rather than quoted second-hand. What can be stated in advance is that the fraudulent class will be a small minority, which shapes almost every methodological decision that follows.</w:t>
       </w:r>
     </w:p>
     <w:p>
@@ -7751,6 +8005,13 @@
           <w:color w:val="000000" w:themeColor="text1"/>
         </w:rPr>
       </w:pPr>
+      <w:r>
+        <w:rPr>
+          <w:rFonts w:eastAsiaTheme="minorEastAsia"/>
+          <w:color w:val="000000" w:themeColor="text1"/>
+        </w:rPr>
+        <w:t xml:space="preserve">The second kind of data is the ledger itself. No publicly available dataset of blockchain-recorded insurance claims was found during the literature review, which is unsurprising given how recent this work is. </w:t>
+      </w:r>
     </w:p>
     <w:p>
       <w:pPr>
@@ -7761,23 +8022,22 @@
           <w:color w:val="000000" w:themeColor="text1"/>
         </w:rPr>
       </w:pPr>
-      <w:r>
-        <w:rPr>
-          <w:rFonts w:eastAsiaTheme="minorEastAsia"/>
-          <w:b/>
-          <w:bCs/>
-          <w:color w:val="000000" w:themeColor="text1"/>
+    </w:p>
+    <w:p>
+      <w:pPr>
+        <w:pStyle w:val="Heading2"/>
+      </w:pPr>
+      <w:bookmarkStart w:id="33" w:name="_Toc128056030"/>
+      <w:bookmarkStart w:id="34" w:name="_Toc128143305"/>
+      <w:r>
+        <w:rPr>
+          <w:lang w:val="en-US"/>
         </w:rPr>
         <w:lastRenderedPageBreak/>
-        <w:t>Data preprocessing:</w:t>
-      </w:r>
-      <w:r>
-        <w:rPr>
-          <w:rFonts w:eastAsiaTheme="minorEastAsia"/>
-          <w:color w:val="000000" w:themeColor="text1"/>
-        </w:rPr>
-        <w:t xml:space="preserve"> The collected data will be preprocessed to ensure consistency and compatibility across different data sources.</w:t>
-      </w:r>
+        <w:t>ML/AI Model Development</w:t>
+      </w:r>
+      <w:bookmarkEnd w:id="33"/>
+      <w:bookmarkEnd w:id="34"/>
     </w:p>
     <w:p>
       <w:pPr>
@@ -7793,23 +8053,8 @@
           <w:rFonts w:eastAsiaTheme="minorEastAsia"/>
           <w:color w:val="000000" w:themeColor="text1"/>
         </w:rPr>
-        <w:t xml:space="preserve">Note: you should use references to explain data collection and preprocessing techniques </w:t>
-      </w:r>
-    </w:p>
-    <w:p>
-      <w:pPr>
-        <w:pStyle w:val="Heading2"/>
-      </w:pPr>
-      <w:bookmarkStart w:id="34" w:name="_Toc128056030"/>
-      <w:bookmarkStart w:id="35" w:name="_Toc128143305"/>
-      <w:r>
-        <w:rPr>
-          <w:lang w:val="en-US"/>
-        </w:rPr>
-        <w:t>ML/AI Model Development</w:t>
-      </w:r>
-      <w:bookmarkEnd w:id="34"/>
-      <w:bookmarkEnd w:id="35"/>
+        <w:t xml:space="preserve">Describe ML/AI/DL models you are using to develop the proposed system. </w:t>
+      </w:r>
     </w:p>
     <w:p>
       <w:pPr>
@@ -7825,7 +8070,7 @@
           <w:rFonts w:eastAsiaTheme="minorEastAsia"/>
           <w:color w:val="000000" w:themeColor="text1"/>
         </w:rPr>
-        <w:t xml:space="preserve">Describe ML/AI/DL models you are using to develop the proposed system. </w:t>
+        <w:t>For example, for the selected title, A deep ensemble learning model will be developed to integrate the preprocessed data from multiple sources and provide personalized healthcare recommendations for each patient.</w:t>
       </w:r>
     </w:p>
     <w:p>
@@ -7842,8 +8087,49 @@
           <w:rFonts w:eastAsiaTheme="minorEastAsia"/>
           <w:color w:val="000000" w:themeColor="text1"/>
         </w:rPr>
-        <w:t>For example, for the selected title, A deep ensemble learning model will be developed to integrate the preprocessed data from multiple sources and provide personalized healthcare recommendations for each patient.</w:t>
-      </w:r>
+        <w:t xml:space="preserve">Here it should have an end-to-end pipeline from the model input to generate desired </w:t>
+      </w:r>
+      <w:proofErr w:type="gramStart"/>
+      <w:r>
+        <w:rPr>
+          <w:rFonts w:eastAsiaTheme="minorEastAsia"/>
+          <w:color w:val="000000" w:themeColor="text1"/>
+        </w:rPr>
+        <w:t>output</w:t>
+      </w:r>
+      <w:r>
+        <w:rPr>
+          <w:rFonts w:eastAsiaTheme="minorEastAsia"/>
+          <w:color w:val="000000" w:themeColor="text1"/>
+        </w:rPr>
+        <w:t>, and</w:t>
+      </w:r>
+      <w:proofErr w:type="gramEnd"/>
+      <w:r>
+        <w:rPr>
+          <w:rFonts w:eastAsiaTheme="minorEastAsia"/>
+          <w:color w:val="000000" w:themeColor="text1"/>
+        </w:rPr>
+        <w:t xml:space="preserve"> describe with the help of related reference the internal functionality of the proposed models. </w:t>
+      </w:r>
+    </w:p>
+    <w:p>
+      <w:pPr>
+        <w:pStyle w:val="Heading2"/>
+        <w:rPr>
+          <w:lang w:val="en-US"/>
+        </w:rPr>
+      </w:pPr>
+      <w:bookmarkStart w:id="35" w:name="_Toc128056031"/>
+      <w:bookmarkStart w:id="36" w:name="_Toc128143306"/>
+      <w:r>
+        <w:rPr>
+          <w:lang w:val="en-US"/>
+        </w:rPr>
+        <w:t>Evaluation of the Proposed System</w:t>
+      </w:r>
+      <w:bookmarkEnd w:id="35"/>
+      <w:bookmarkEnd w:id="36"/>
     </w:p>
     <w:p>
       <w:pPr>
@@ -7859,49 +8145,8 @@
           <w:rFonts w:eastAsiaTheme="minorEastAsia"/>
           <w:color w:val="000000" w:themeColor="text1"/>
         </w:rPr>
-        <w:t xml:space="preserve">Here it should have an end-to-end pipeline from the model input to generate desired </w:t>
-      </w:r>
-      <w:proofErr w:type="gramStart"/>
-      <w:r>
-        <w:rPr>
-          <w:rFonts w:eastAsiaTheme="minorEastAsia"/>
-          <w:color w:val="000000" w:themeColor="text1"/>
-        </w:rPr>
-        <w:t>output</w:t>
-      </w:r>
-      <w:r>
-        <w:rPr>
-          <w:rFonts w:eastAsiaTheme="minorEastAsia"/>
-          <w:color w:val="000000" w:themeColor="text1"/>
-        </w:rPr>
-        <w:t>, and</w:t>
-      </w:r>
-      <w:proofErr w:type="gramEnd"/>
-      <w:r>
-        <w:rPr>
-          <w:rFonts w:eastAsiaTheme="minorEastAsia"/>
-          <w:color w:val="000000" w:themeColor="text1"/>
-        </w:rPr>
-        <w:t xml:space="preserve"> describe with the help of related reference the internal functionality of the proposed models. </w:t>
-      </w:r>
-    </w:p>
-    <w:p>
-      <w:pPr>
-        <w:pStyle w:val="Heading2"/>
-        <w:rPr>
-          <w:lang w:val="en-US"/>
-        </w:rPr>
-      </w:pPr>
-      <w:bookmarkStart w:id="36" w:name="_Toc128056031"/>
-      <w:bookmarkStart w:id="37" w:name="_Toc128143306"/>
-      <w:r>
-        <w:rPr>
-          <w:lang w:val="en-US"/>
-        </w:rPr>
-        <w:t>Evaluation of the Proposed System</w:t>
-      </w:r>
-      <w:bookmarkEnd w:id="36"/>
-      <w:bookmarkEnd w:id="37"/>
+        <w:t xml:space="preserve">In this section describe how you are going to evaluate your system. </w:t>
+      </w:r>
     </w:p>
     <w:p>
       <w:pPr>
@@ -7917,7 +8162,21 @@
           <w:rFonts w:eastAsiaTheme="minorEastAsia"/>
           <w:color w:val="000000" w:themeColor="text1"/>
         </w:rPr>
-        <w:t xml:space="preserve">In this section describe how you are going to evaluate your system. </w:t>
+        <w:t>Define the evaluation metrics used to assess the performance of the AI-based system, such as accuracy, sensitivity, specificity, and F1 score.</w:t>
+      </w:r>
+      <w:r>
+        <w:rPr>
+          <w:rFonts w:eastAsiaTheme="minorEastAsia"/>
+          <w:color w:val="000000" w:themeColor="text1"/>
+        </w:rPr>
+        <w:t xml:space="preserve"> Use relevant references, equation definition etc. to justify why you are selecting the specific evaluation metrics for the performance measurements.</w:t>
+      </w:r>
+      <w:r>
+        <w:rPr>
+          <w:rFonts w:eastAsiaTheme="minorEastAsia"/>
+          <w:color w:val="000000" w:themeColor="text1"/>
+        </w:rPr>
+        <w:t xml:space="preserve"> </w:t>
       </w:r>
     </w:p>
     <w:p>
@@ -7926,29 +8185,15 @@
         <w:jc w:val="both"/>
         <w:rPr>
           <w:rFonts w:eastAsiaTheme="minorEastAsia"/>
-          <w:color w:val="000000" w:themeColor="text1"/>
-        </w:rPr>
-      </w:pPr>
-      <w:r>
-        <w:rPr>
-          <w:rFonts w:eastAsiaTheme="minorEastAsia"/>
-          <w:color w:val="000000" w:themeColor="text1"/>
-        </w:rPr>
-        <w:t>Define the evaluation metrics used to assess the performance of the AI-based system, such as accuracy, sensitivity, specificity, and F1 score.</w:t>
-      </w:r>
-      <w:r>
-        <w:rPr>
-          <w:rFonts w:eastAsiaTheme="minorEastAsia"/>
-          <w:color w:val="000000" w:themeColor="text1"/>
-        </w:rPr>
-        <w:t xml:space="preserve"> Use relevant references, equation definition etc. to justify why you are selecting the specific evaluation metrics for the performance measurements.</w:t>
-      </w:r>
-      <w:r>
-        <w:rPr>
-          <w:rFonts w:eastAsiaTheme="minorEastAsia"/>
-          <w:color w:val="000000" w:themeColor="text1"/>
-        </w:rPr>
-        <w:t xml:space="preserve"> </w:t>
+          <w:color w:val="4472C4" w:themeColor="accent1"/>
+        </w:rPr>
+      </w:pPr>
+      <w:r>
+        <w:rPr>
+          <w:rFonts w:eastAsiaTheme="minorEastAsia"/>
+          <w:color w:val="4472C4" w:themeColor="accent1"/>
+        </w:rPr>
+        <w:t>Example: The smart healthcare recommendation system will be evaluated using a randomized controlled trial with multidisciplinary diabetes patients. The primary outcome measure will be healthcare outcomes, including glycemic control, blood pressure, and quality of life. Secondary outcome measures will include patient satisfaction and healthcare resource utilization.</w:t>
       </w:r>
     </w:p>
     <w:p>
@@ -7965,23 +8210,6 @@
           <w:rFonts w:eastAsiaTheme="minorEastAsia"/>
           <w:color w:val="4472C4" w:themeColor="accent1"/>
         </w:rPr>
-        <w:t>Example: The smart healthcare recommendation system will be evaluated using a randomized controlled trial with multidisciplinary diabetes patients. The primary outcome measure will be healthcare outcomes, including glycemic control, blood pressure, and quality of life. Secondary outcome measures will include patient satisfaction and healthcare resource utilization.</w:t>
-      </w:r>
-    </w:p>
-    <w:p>
-      <w:pPr>
-        <w:spacing w:line="360" w:lineRule="auto"/>
-        <w:jc w:val="both"/>
-        <w:rPr>
-          <w:rFonts w:eastAsiaTheme="minorEastAsia"/>
-          <w:color w:val="4472C4" w:themeColor="accent1"/>
-        </w:rPr>
-      </w:pPr>
-      <w:r>
-        <w:rPr>
-          <w:rFonts w:eastAsiaTheme="minorEastAsia"/>
-          <w:color w:val="4472C4" w:themeColor="accent1"/>
-        </w:rPr>
         <w:t>Qualitative interviews will be conducted with healthcare professionals and patients to identify any barriers and limitations to the adoption of the smart healthcare recommendation system in clinical practice.</w:t>
       </w:r>
     </w:p>
@@ -7989,11 +8217,11 @@
       <w:pPr>
         <w:pStyle w:val="Heading2"/>
       </w:pPr>
-      <w:bookmarkStart w:id="38" w:name="_Toc128143307"/>
+      <w:bookmarkStart w:id="37" w:name="_Toc128143307"/>
       <w:r>
         <w:t>Others (according to your selected topic)</w:t>
       </w:r>
-      <w:bookmarkEnd w:id="38"/>
+      <w:bookmarkEnd w:id="37"/>
     </w:p>
     <w:p>
       <w:r>
@@ -8017,9 +8245,9 @@
         <w:pStyle w:val="Heading1"/>
         <w:ind w:left="0" w:firstLine="0"/>
       </w:pPr>
-      <w:bookmarkStart w:id="39" w:name="_Toc128143308"/>
-      <w:bookmarkStart w:id="40" w:name="_Toc404008245"/>
-      <w:bookmarkEnd w:id="39"/>
+      <w:bookmarkStart w:id="38" w:name="_Toc128143308"/>
+      <w:bookmarkStart w:id="39" w:name="_Toc404008245"/>
+      <w:bookmarkEnd w:id="38"/>
     </w:p>
     <w:p>
       <w:pPr>
@@ -8029,11 +8257,11 @@
           <w:numId w:val="0"/>
         </w:numPr>
       </w:pPr>
-      <w:bookmarkStart w:id="41" w:name="_Toc128143309"/>
+      <w:bookmarkStart w:id="40" w:name="_Toc128143309"/>
       <w:r>
         <w:t>Experimental Results</w:t>
       </w:r>
-      <w:bookmarkEnd w:id="41"/>
+      <w:bookmarkEnd w:id="40"/>
     </w:p>
     <w:p>
       <w:pPr>
@@ -8049,6 +8277,7 @@
           <w:rFonts w:eastAsiaTheme="minorEastAsia"/>
           <w:color w:val="FF0000"/>
         </w:rPr>
+        <w:lastRenderedPageBreak/>
         <w:t xml:space="preserve">Note: You can have </w:t>
       </w:r>
       <w:r>
@@ -8161,11 +8390,11 @@
           <w:color w:val="000000" w:themeColor="text1"/>
         </w:rPr>
       </w:pPr>
-      <w:bookmarkStart w:id="42" w:name="_Toc128143310"/>
+      <w:bookmarkStart w:id="41" w:name="_Toc128143310"/>
       <w:r>
         <w:t>Experimental Setup</w:t>
       </w:r>
-      <w:bookmarkEnd w:id="42"/>
+      <w:bookmarkEnd w:id="41"/>
     </w:p>
     <w:p>
       <w:pPr>
@@ -8192,11 +8421,11 @@
           <w:color w:val="000000" w:themeColor="text1"/>
         </w:rPr>
       </w:pPr>
-      <w:bookmarkStart w:id="43" w:name="_Toc128143311"/>
+      <w:bookmarkStart w:id="42" w:name="_Toc128143311"/>
       <w:r>
         <w:t>Dataset Description</w:t>
       </w:r>
-      <w:bookmarkEnd w:id="43"/>
+      <w:bookmarkEnd w:id="42"/>
     </w:p>
     <w:p>
       <w:pPr>
@@ -8256,15 +8485,7 @@
         <w:t xml:space="preserve">[ref]. </w:t>
       </w:r>
       <w:r>
-        <w:t xml:space="preserve">The Hospital Frankfurt Germany diabetes dataset consists of 2000 cases with eight features. The Pima Indians diabetes dataset consists of 768 patients with eight features. The fused features dataset for an experiment was made with the combination of features of both datasets. Both </w:t>
-      </w:r>
-      <w:proofErr w:type="spellStart"/>
-      <w:r>
-        <w:t>datasets’</w:t>
-      </w:r>
-      <w:proofErr w:type="spellEnd"/>
-      <w:r>
-        <w:t xml:space="preserve"> cases with some missing values are managed with proposed filtering, and normalization techniques were discussed earlier in chapter 4. The combined, fused dataset features are shown in </w:t>
+        <w:t xml:space="preserve">The Hospital Frankfurt Germany diabetes dataset consists of 2000 cases with eight features. The Pima Indians diabetes dataset consists of 768 patients with eight features. The fused features dataset for an experiment was made with the combination of features of both datasets. Both datasets’ cases with some missing values are managed with proposed filtering, and normalization techniques were discussed earlier in chapter 4. The combined, fused dataset features are shown in </w:t>
       </w:r>
       <w:r>
         <w:rPr>
@@ -8287,11 +8508,11 @@
         <w:pStyle w:val="Heading2"/>
         <w:ind w:left="578" w:hanging="578"/>
       </w:pPr>
-      <w:bookmarkStart w:id="44" w:name="_Toc128143312"/>
+      <w:bookmarkStart w:id="43" w:name="_Toc128143312"/>
       <w:r>
         <w:t>Results</w:t>
       </w:r>
-      <w:bookmarkEnd w:id="44"/>
+      <w:bookmarkEnd w:id="43"/>
     </w:p>
     <w:p>
       <w:pPr>
@@ -8299,7 +8520,6 @@
         <w:jc w:val="both"/>
       </w:pPr>
       <w:r>
-        <w:lastRenderedPageBreak/>
         <w:t xml:space="preserve">Describe the steps taken to evaluate the performance of the AI-based </w:t>
       </w:r>
       <w:r>
@@ -8315,6 +8535,7 @@
         <w:jc w:val="both"/>
       </w:pPr>
       <w:r>
+        <w:lastRenderedPageBreak/>
         <w:t>Present the results of the experiments, including the performance metrics and its comparison with the baseline methods</w:t>
       </w:r>
       <w:r>
@@ -8367,11 +8588,11 @@
         <w:pStyle w:val="Heading2"/>
         <w:ind w:left="578" w:hanging="578"/>
       </w:pPr>
-      <w:bookmarkStart w:id="45" w:name="_Toc128143313"/>
+      <w:bookmarkStart w:id="44" w:name="_Toc128143313"/>
       <w:r>
         <w:t>Comparison with Baseline Methods</w:t>
       </w:r>
-      <w:bookmarkEnd w:id="45"/>
+      <w:bookmarkEnd w:id="44"/>
     </w:p>
     <w:p>
       <w:pPr>
@@ -8423,24 +8644,24 @@
         <w:lastRenderedPageBreak/>
         <w:br/>
       </w:r>
-      <w:bookmarkStart w:id="46" w:name="_Toc128143314"/>
+      <w:bookmarkStart w:id="45" w:name="_Toc128143314"/>
       <w:r>
         <w:t>Conclusion and Future Work</w:t>
       </w:r>
-      <w:bookmarkEnd w:id="40"/>
+      <w:bookmarkEnd w:id="39"/>
+      <w:bookmarkEnd w:id="45"/>
+    </w:p>
+    <w:p>
+      <w:pPr>
+        <w:pStyle w:val="Heading2"/>
+      </w:pPr>
+      <w:bookmarkStart w:id="46" w:name="_Toc404008246"/>
+      <w:bookmarkStart w:id="47" w:name="_Toc128143315"/>
+      <w:r>
+        <w:t>Conclusion</w:t>
+      </w:r>
       <w:bookmarkEnd w:id="46"/>
-    </w:p>
-    <w:p>
-      <w:pPr>
-        <w:pStyle w:val="Heading2"/>
-      </w:pPr>
-      <w:bookmarkStart w:id="47" w:name="_Toc404008246"/>
-      <w:bookmarkStart w:id="48" w:name="_Toc128143315"/>
-      <w:r>
-        <w:t>Conclusion</w:t>
-      </w:r>
       <w:bookmarkEnd w:id="47"/>
-      <w:bookmarkEnd w:id="48"/>
       <w:r>
         <w:t xml:space="preserve"> </w:t>
       </w:r>
@@ -8465,13 +8686,13 @@
       <w:pPr>
         <w:pStyle w:val="Heading2"/>
       </w:pPr>
-      <w:bookmarkStart w:id="49" w:name="_Toc404008247"/>
-      <w:bookmarkStart w:id="50" w:name="_Toc128143316"/>
+      <w:bookmarkStart w:id="48" w:name="_Toc404008247"/>
+      <w:bookmarkStart w:id="49" w:name="_Toc128143316"/>
       <w:r>
         <w:t>Future Work</w:t>
       </w:r>
+      <w:bookmarkEnd w:id="48"/>
       <w:bookmarkEnd w:id="49"/>
-      <w:bookmarkEnd w:id="50"/>
       <w:r>
         <w:t xml:space="preserve"> </w:t>
       </w:r>
@@ -8510,7 +8731,7 @@
     </w:p>
     <w:p/>
     <w:p>
-      <w:bookmarkStart w:id="51" w:name="_Toc394498202"/>
+      <w:bookmarkStart w:id="50" w:name="_Toc394498202"/>
       <w:r>
         <w:br w:type="page"/>
       </w:r>
@@ -8522,15 +8743,15 @@
           <w:tab w:val="center" w:pos="4320"/>
         </w:tabs>
       </w:pPr>
-      <w:bookmarkStart w:id="52" w:name="_Toc404008248"/>
-      <w:bookmarkStart w:id="53" w:name="_Toc128143317"/>
+      <w:bookmarkStart w:id="51" w:name="_Toc404008248"/>
+      <w:bookmarkStart w:id="52" w:name="_Toc128143317"/>
       <w:r>
         <w:lastRenderedPageBreak/>
         <w:t>References</w:t>
       </w:r>
+      <w:bookmarkEnd w:id="50"/>
       <w:bookmarkEnd w:id="51"/>
       <w:bookmarkEnd w:id="52"/>
-      <w:bookmarkEnd w:id="53"/>
       <w:r>
         <w:tab/>
       </w:r>
@@ -8584,15 +8805,7 @@
         <w:t xml:space="preserve">     </w:t>
       </w:r>
       <w:r>
-        <w:t xml:space="preserve">City of Publisher, Country if not USA: Abbrev. of Publisher, year, </w:t>
-      </w:r>
-      <w:proofErr w:type="spellStart"/>
-      <w:r>
-        <w:t>ch.</w:t>
-      </w:r>
-      <w:proofErr w:type="spellEnd"/>
-      <w:r>
-        <w:t xml:space="preserve"> x, sec. x, pp. </w:t>
+        <w:t xml:space="preserve">City of Publisher, Country if not USA: Abbrev. of Publisher, year, ch. x, sec. x, pp. </w:t>
       </w:r>
       <w:r>
         <w:t xml:space="preserve">  </w:t>
@@ -8781,9 +8994,9 @@
           <w:lang w:val="x-none"/>
         </w:rPr>
       </w:pPr>
-      <w:bookmarkStart w:id="54" w:name="_Toc303784826"/>
-      <w:bookmarkStart w:id="55" w:name="_Toc394498203"/>
-      <w:bookmarkStart w:id="56" w:name="_Toc404008249"/>
+      <w:bookmarkStart w:id="53" w:name="_Toc303784826"/>
+      <w:bookmarkStart w:id="54" w:name="_Toc394498203"/>
+      <w:bookmarkStart w:id="55" w:name="_Toc404008249"/>
       <w:r>
         <w:br w:type="page"/>
       </w:r>
@@ -8792,7 +9005,7 @@
       <w:pPr>
         <w:pStyle w:val="Titles"/>
       </w:pPr>
-      <w:bookmarkStart w:id="57" w:name="_Toc128143318"/>
+      <w:bookmarkStart w:id="56" w:name="_Toc128143318"/>
       <w:r>
         <w:lastRenderedPageBreak/>
         <w:t>Appendix A.</w:t>
@@ -8806,10 +9019,10 @@
       <w:r>
         <w:t>Title of Appendix</w:t>
       </w:r>
+      <w:bookmarkEnd w:id="53"/>
       <w:bookmarkEnd w:id="54"/>
       <w:bookmarkEnd w:id="55"/>
       <w:bookmarkEnd w:id="56"/>
-      <w:bookmarkEnd w:id="57"/>
     </w:p>
     <w:p>
       <w:pPr>
@@ -8878,7 +9091,7 @@
           <w:lang w:val="x-none"/>
         </w:rPr>
       </w:pPr>
-      <w:bookmarkStart w:id="58" w:name="_Toc394498204"/>
+      <w:bookmarkStart w:id="57" w:name="_Toc394498204"/>
       <w:r>
         <w:br w:type="page"/>
       </w:r>
@@ -8887,8 +9100,8 @@
       <w:pPr>
         <w:pStyle w:val="Titles"/>
       </w:pPr>
-      <w:bookmarkStart w:id="59" w:name="_Toc404008250"/>
-      <w:bookmarkStart w:id="60" w:name="_Toc128143319"/>
+      <w:bookmarkStart w:id="58" w:name="_Toc404008250"/>
+      <w:bookmarkStart w:id="59" w:name="_Toc128143319"/>
       <w:r>
         <w:lastRenderedPageBreak/>
         <w:t>Appendix B.</w:t>
@@ -8896,15 +9109,15 @@
       <w:r>
         <w:tab/>
       </w:r>
+      <w:bookmarkEnd w:id="57"/>
+      <w:r>
+        <w:tab/>
+      </w:r>
+      <w:r>
+        <w:t>Title of Appendix</w:t>
+      </w:r>
       <w:bookmarkEnd w:id="58"/>
-      <w:r>
-        <w:tab/>
-      </w:r>
-      <w:r>
-        <w:t>Title of Appendix</w:t>
-      </w:r>
       <w:bookmarkEnd w:id="59"/>
-      <w:bookmarkEnd w:id="60"/>
       <w:r>
         <w:t xml:space="preserve"> </w:t>
       </w:r>
@@ -8930,7 +9143,7 @@
 </file>
 
 <file path=word/endnotes.xml><?xml version="1.0" encoding="utf-8"?>
-<w:endnotes xmlns:wpc="http://schemas.microsoft.com/office/word/2010/wordprocessingCanvas" xmlns:cx="http://schemas.microsoft.com/office/drawing/2014/chartex" xmlns:cx1="http://schemas.microsoft.com/office/drawing/2015/9/8/chartex" xmlns:cx2="http://schemas.microsoft.com/office/drawing/2015/10/21/chartex" xmlns:cx3="http://schemas.microsoft.com/office/drawing/2016/5/9/chartex" xmlns:cx4="http://schemas.microsoft.com/office/drawing/2016/5/10/chartex" xmlns:cx5="http://schemas.microsoft.com/office/drawing/2016/5/11/chartex" xmlns:cx6="http://schemas.microsoft.com/office/drawing/2016/5/12/chartex" xmlns:cx7="http://schemas.microsoft.com/office/drawing/2016/5/13/chartex" xmlns:cx8="http://schemas.microsoft.com/office/drawing/2016/5/14/chartex" xmlns:mc="http://schemas.openxmlformats.org/markup-compatibility/2006" xmlns:aink="http://schemas.microsoft.com/office/drawing/2016/ink" xmlns:am3d="http://schemas.microsoft.com/office/drawing/2017/model3d" xmlns:o="urn:schemas-microsoft-com:office:office" xmlns:oel="http://schemas.microsoft.com/office/2019/extlst" xmlns:r="http://schemas.openxmlformats.org/officeDocument/2006/relationships" xmlns:m="http://schemas.openxmlformats.org/officeDocument/2006/math" xmlns:v="urn:schemas-microsoft-com:vml" xmlns:wp14="http://schemas.microsoft.com/office/word/2010/wordprocessingDrawing" xmlns:wp="http://schemas.openxmlformats.org/drawingml/2006/wordprocessingDrawing" xmlns:w10="urn:schemas-microsoft-com:office:word" xmlns:w="http://schemas.openxmlformats.org/wordprocessingml/2006/main" xmlns:w14="http://schemas.microsoft.com/office/word/2010/wordml" xmlns:w15="http://schemas.microsoft.com/office/word/2012/wordml" xmlns:w16cex="http://schemas.microsoft.com/office/word/2018/wordml/cex" xmlns:w16cid="http://schemas.microsoft.com/office/word/2016/wordml/cid" xmlns:w16="http://schemas.microsoft.com/office/word/2018/wordml" xmlns:w16du="http://schemas.microsoft.com/office/word/2023/wordml/word16du" xmlns:w16sdtdh="http://schemas.microsoft.com/office/word/2020/wordml/sdtdatahash" xmlns:w16sdtfl="http://schemas.microsoft.com/office/word/2024/wordml/sdtformatlock" xmlns:w16se="http://schemas.microsoft.com/office/word/2015/wordml/symex" xmlns:wpg="http://schemas.microsoft.com/office/word/2010/wordprocessingGroup" xmlns:wpi="http://schemas.microsoft.com/office/word/2010/wordprocessingInk" xmlns:wne="http://schemas.microsoft.com/office/word/2006/wordml" xmlns:wps="http://schemas.microsoft.com/office/word/2010/wordprocessingShape" mc:Ignorable="w14 w15 w16se w16cid w16 w16cex w16sdtdh w16sdtfl w16du wp14">
+<w:endnotes xmlns:wpc="http://schemas.microsoft.com/office/word/2010/wordprocessingCanvas" xmlns:cx="http://schemas.microsoft.com/office/drawing/2014/chartex" xmlns:cx1="http://schemas.microsoft.com/office/drawing/2015/9/8/chartex" xmlns:cx2="http://schemas.microsoft.com/office/drawing/2015/10/21/chartex" xmlns:cx3="http://schemas.microsoft.com/office/drawing/2016/5/9/chartex" xmlns:cx4="http://schemas.microsoft.com/office/drawing/2016/5/10/chartex" xmlns:cx5="http://schemas.microsoft.com/office/drawing/2016/5/11/chartex" xmlns:cx6="http://schemas.microsoft.com/office/drawing/2016/5/12/chartex" xmlns:cx7="http://schemas.microsoft.com/office/drawing/2016/5/13/chartex" xmlns:cx8="http://schemas.microsoft.com/office/drawing/2016/5/14/chartex" xmlns:mc="http://schemas.openxmlformats.org/markup-compatibility/2006" xmlns:m="http://schemas.openxmlformats.org/officeDocument/2006/math" xmlns:aink="http://schemas.microsoft.com/office/drawing/2016/ink" xmlns:am3d="http://schemas.microsoft.com/office/drawing/2017/model3d" xmlns:oel="http://schemas.microsoft.com/office/2019/extlst" xmlns:r="http://schemas.openxmlformats.org/officeDocument/2006/relationships" xmlns:wp14="http://schemas.microsoft.com/office/word/2010/wordprocessingDrawing" xmlns:wp="http://schemas.openxmlformats.org/drawingml/2006/wordprocessingDrawing" xmlns:wpg="http://schemas.microsoft.com/office/word/2010/wordprocessingGroup" xmlns:wpi="http://schemas.microsoft.com/office/word/2010/wordprocessingInk" xmlns:wps="http://schemas.microsoft.com/office/word/2010/wordprocessingShape" xmlns:o="urn:schemas-microsoft-com:office:office" xmlns:v="urn:schemas-microsoft-com:vml" xmlns:w10="urn:schemas-microsoft-com:office:word" xmlns:w="http://schemas.openxmlformats.org/wordprocessingml/2006/main" xmlns:w14="http://schemas.microsoft.com/office/word/2010/wordml" xmlns:w15="http://schemas.microsoft.com/office/word/2012/wordml" xmlns:w16cei="http://schemas.microsoft.com/office/word/2026/wordml/cei" xmlns:w16cex="http://schemas.microsoft.com/office/word/2018/wordml/cex" xmlns:w16cid="http://schemas.microsoft.com/office/word/2016/wordml/cid" xmlns:w16="http://schemas.microsoft.com/office/word/2018/wordml" xmlns:w16sdtdh="http://schemas.microsoft.com/office/word/2020/wordml/sdtdatahash" xmlns:w16sdtfl="http://schemas.microsoft.com/office/word/2024/wordml/sdtformatlock" xmlns:w16se="http://schemas.microsoft.com/office/word/2015/wordml/symex" xmlns:w16du="http://schemas.microsoft.com/office/word/2023/wordml/word16du" xmlns:wne="http://schemas.microsoft.com/office/word/2006/wordml" mc:Ignorable="w14 w15 w16se w16cid w16 w16cex w16sdtdh w16sdtfl w16du wp14">
   <w:endnote w:type="separator" w:id="-1">
     <w:p>
       <w:r>
@@ -8949,7 +9162,7 @@
 </file>
 
 <file path=word/footer1.xml><?xml version="1.0" encoding="utf-8"?>
-<w:ftr xmlns:wpc="http://schemas.microsoft.com/office/word/2010/wordprocessingCanvas" xmlns:cx="http://schemas.microsoft.com/office/drawing/2014/chartex" xmlns:cx1="http://schemas.microsoft.com/office/drawing/2015/9/8/chartex" xmlns:cx2="http://schemas.microsoft.com/office/drawing/2015/10/21/chartex" xmlns:cx3="http://schemas.microsoft.com/office/drawing/2016/5/9/chartex" xmlns:cx4="http://schemas.microsoft.com/office/drawing/2016/5/10/chartex" xmlns:cx5="http://schemas.microsoft.com/office/drawing/2016/5/11/chartex" xmlns:cx6="http://schemas.microsoft.com/office/drawing/2016/5/12/chartex" xmlns:cx7="http://schemas.microsoft.com/office/drawing/2016/5/13/chartex" xmlns:cx8="http://schemas.microsoft.com/office/drawing/2016/5/14/chartex" xmlns:mc="http://schemas.openxmlformats.org/markup-compatibility/2006" xmlns:aink="http://schemas.microsoft.com/office/drawing/2016/ink" xmlns:am3d="http://schemas.microsoft.com/office/drawing/2017/model3d" xmlns:o="urn:schemas-microsoft-com:office:office" xmlns:oel="http://schemas.microsoft.com/office/2019/extlst" xmlns:r="http://schemas.openxmlformats.org/officeDocument/2006/relationships" xmlns:m="http://schemas.openxmlformats.org/officeDocument/2006/math" xmlns:v="urn:schemas-microsoft-com:vml" xmlns:wp14="http://schemas.microsoft.com/office/word/2010/wordprocessingDrawing" xmlns:wp="http://schemas.openxmlformats.org/drawingml/2006/wordprocessingDrawing" xmlns:w10="urn:schemas-microsoft-com:office:word" xmlns:w="http://schemas.openxmlformats.org/wordprocessingml/2006/main" xmlns:w14="http://schemas.microsoft.com/office/word/2010/wordml" xmlns:w15="http://schemas.microsoft.com/office/word/2012/wordml" xmlns:w16cex="http://schemas.microsoft.com/office/word/2018/wordml/cex" xmlns:w16cid="http://schemas.microsoft.com/office/word/2016/wordml/cid" xmlns:w16="http://schemas.microsoft.com/office/word/2018/wordml" xmlns:w16du="http://schemas.microsoft.com/office/word/2023/wordml/word16du" xmlns:w16sdtdh="http://schemas.microsoft.com/office/word/2020/wordml/sdtdatahash" xmlns:w16sdtfl="http://schemas.microsoft.com/office/word/2024/wordml/sdtformatlock" xmlns:w16se="http://schemas.microsoft.com/office/word/2015/wordml/symex" xmlns:wpg="http://schemas.microsoft.com/office/word/2010/wordprocessingGroup" xmlns:wpi="http://schemas.microsoft.com/office/word/2010/wordprocessingInk" xmlns:wne="http://schemas.microsoft.com/office/word/2006/wordml" xmlns:wps="http://schemas.microsoft.com/office/word/2010/wordprocessingShape" mc:Ignorable="w14 w15 w16se w16cid w16 w16cex w16sdtdh w16sdtfl w16du wp14">
+<w:ftr xmlns:wpc="http://schemas.microsoft.com/office/word/2010/wordprocessingCanvas" xmlns:cx="http://schemas.microsoft.com/office/drawing/2014/chartex" xmlns:cx1="http://schemas.microsoft.com/office/drawing/2015/9/8/chartex" xmlns:cx2="http://schemas.microsoft.com/office/drawing/2015/10/21/chartex" xmlns:cx3="http://schemas.microsoft.com/office/drawing/2016/5/9/chartex" xmlns:cx4="http://schemas.microsoft.com/office/drawing/2016/5/10/chartex" xmlns:cx5="http://schemas.microsoft.com/office/drawing/2016/5/11/chartex" xmlns:cx6="http://schemas.microsoft.com/office/drawing/2016/5/12/chartex" xmlns:cx7="http://schemas.microsoft.com/office/drawing/2016/5/13/chartex" xmlns:cx8="http://schemas.microsoft.com/office/drawing/2016/5/14/chartex" xmlns:mc="http://schemas.openxmlformats.org/markup-compatibility/2006" xmlns:m="http://schemas.openxmlformats.org/officeDocument/2006/math" xmlns:aink="http://schemas.microsoft.com/office/drawing/2016/ink" xmlns:am3d="http://schemas.microsoft.com/office/drawing/2017/model3d" xmlns:oel="http://schemas.microsoft.com/office/2019/extlst" xmlns:r="http://schemas.openxmlformats.org/officeDocument/2006/relationships" xmlns:wp14="http://schemas.microsoft.com/office/word/2010/wordprocessingDrawing" xmlns:wp="http://schemas.openxmlformats.org/drawingml/2006/wordprocessingDrawing" xmlns:wpg="http://schemas.microsoft.com/office/word/2010/wordprocessingGroup" xmlns:wpi="http://schemas.microsoft.com/office/word/2010/wordprocessingInk" xmlns:wps="http://schemas.microsoft.com/office/word/2010/wordprocessingShape" xmlns:o="urn:schemas-microsoft-com:office:office" xmlns:v="urn:schemas-microsoft-com:vml" xmlns:w10="urn:schemas-microsoft-com:office:word" xmlns:w="http://schemas.openxmlformats.org/wordprocessingml/2006/main" xmlns:w14="http://schemas.microsoft.com/office/word/2010/wordml" xmlns:w15="http://schemas.microsoft.com/office/word/2012/wordml" xmlns:w16cei="http://schemas.microsoft.com/office/word/2026/wordml/cei" xmlns:w16cex="http://schemas.microsoft.com/office/word/2018/wordml/cex" xmlns:w16cid="http://schemas.microsoft.com/office/word/2016/wordml/cid" xmlns:w16="http://schemas.microsoft.com/office/word/2018/wordml" xmlns:w16sdtdh="http://schemas.microsoft.com/office/word/2020/wordml/sdtdatahash" xmlns:w16sdtfl="http://schemas.microsoft.com/office/word/2024/wordml/sdtformatlock" xmlns:w16se="http://schemas.microsoft.com/office/word/2015/wordml/symex" xmlns:w16du="http://schemas.microsoft.com/office/word/2023/wordml/word16du" xmlns:wne="http://schemas.microsoft.com/office/word/2006/wordml" mc:Ignorable="w14 w15 w16se w16cid w16 w16cex w16sdtdh w16sdtfl w16du wp14">
   <w:sdt>
     <w:sdtPr>
       <w:id w:val="1521736399"/>
@@ -9001,7 +9214,7 @@
 </file>
 
 <file path=word/footer2.xml><?xml version="1.0" encoding="utf-8"?>
-<w:ftr xmlns:wpc="http://schemas.microsoft.com/office/word/2010/wordprocessingCanvas" xmlns:cx="http://schemas.microsoft.com/office/drawing/2014/chartex" xmlns:cx1="http://schemas.microsoft.com/office/drawing/2015/9/8/chartex" xmlns:cx2="http://schemas.microsoft.com/office/drawing/2015/10/21/chartex" xmlns:cx3="http://schemas.microsoft.com/office/drawing/2016/5/9/chartex" xmlns:cx4="http://schemas.microsoft.com/office/drawing/2016/5/10/chartex" xmlns:cx5="http://schemas.microsoft.com/office/drawing/2016/5/11/chartex" xmlns:cx6="http://schemas.microsoft.com/office/drawing/2016/5/12/chartex" xmlns:cx7="http://schemas.microsoft.com/office/drawing/2016/5/13/chartex" xmlns:cx8="http://schemas.microsoft.com/office/drawing/2016/5/14/chartex" xmlns:mc="http://schemas.openxmlformats.org/markup-compatibility/2006" xmlns:aink="http://schemas.microsoft.com/office/drawing/2016/ink" xmlns:am3d="http://schemas.microsoft.com/office/drawing/2017/model3d" xmlns:o="urn:schemas-microsoft-com:office:office" xmlns:oel="http://schemas.microsoft.com/office/2019/extlst" xmlns:r="http://schemas.openxmlformats.org/officeDocument/2006/relationships" xmlns:m="http://schemas.openxmlformats.org/officeDocument/2006/math" xmlns:v="urn:schemas-microsoft-com:vml" xmlns:wp14="http://schemas.microsoft.com/office/word/2010/wordprocessingDrawing" xmlns:wp="http://schemas.openxmlformats.org/drawingml/2006/wordprocessingDrawing" xmlns:w10="urn:schemas-microsoft-com:office:word" xmlns:w="http://schemas.openxmlformats.org/wordprocessingml/2006/main" xmlns:w14="http://schemas.microsoft.com/office/word/2010/wordml" xmlns:w15="http://schemas.microsoft.com/office/word/2012/wordml" xmlns:w16cex="http://schemas.microsoft.com/office/word/2018/wordml/cex" xmlns:w16cid="http://schemas.microsoft.com/office/word/2016/wordml/cid" xmlns:w16="http://schemas.microsoft.com/office/word/2018/wordml" xmlns:w16du="http://schemas.microsoft.com/office/word/2023/wordml/word16du" xmlns:w16sdtdh="http://schemas.microsoft.com/office/word/2020/wordml/sdtdatahash" xmlns:w16sdtfl="http://schemas.microsoft.com/office/word/2024/wordml/sdtformatlock" xmlns:w16se="http://schemas.microsoft.com/office/word/2015/wordml/symex" xmlns:wpg="http://schemas.microsoft.com/office/word/2010/wordprocessingGroup" xmlns:wpi="http://schemas.microsoft.com/office/word/2010/wordprocessingInk" xmlns:wne="http://schemas.microsoft.com/office/word/2006/wordml" xmlns:wps="http://schemas.microsoft.com/office/word/2010/wordprocessingShape" mc:Ignorable="w14 w15 w16se w16cid w16 w16cex w16sdtdh w16sdtfl w16du wp14">
+<w:ftr xmlns:wpc="http://schemas.microsoft.com/office/word/2010/wordprocessingCanvas" xmlns:cx="http://schemas.microsoft.com/office/drawing/2014/chartex" xmlns:cx1="http://schemas.microsoft.com/office/drawing/2015/9/8/chartex" xmlns:cx2="http://schemas.microsoft.com/office/drawing/2015/10/21/chartex" xmlns:cx3="http://schemas.microsoft.com/office/drawing/2016/5/9/chartex" xmlns:cx4="http://schemas.microsoft.com/office/drawing/2016/5/10/chartex" xmlns:cx5="http://schemas.microsoft.com/office/drawing/2016/5/11/chartex" xmlns:cx6="http://schemas.microsoft.com/office/drawing/2016/5/12/chartex" xmlns:cx7="http://schemas.microsoft.com/office/drawing/2016/5/13/chartex" xmlns:cx8="http://schemas.microsoft.com/office/drawing/2016/5/14/chartex" xmlns:mc="http://schemas.openxmlformats.org/markup-compatibility/2006" xmlns:m="http://schemas.openxmlformats.org/officeDocument/2006/math" xmlns:aink="http://schemas.microsoft.com/office/drawing/2016/ink" xmlns:am3d="http://schemas.microsoft.com/office/drawing/2017/model3d" xmlns:oel="http://schemas.microsoft.com/office/2019/extlst" xmlns:r="http://schemas.openxmlformats.org/officeDocument/2006/relationships" xmlns:wp14="http://schemas.microsoft.com/office/word/2010/wordprocessingDrawing" xmlns:wp="http://schemas.openxmlformats.org/drawingml/2006/wordprocessingDrawing" xmlns:wpg="http://schemas.microsoft.com/office/word/2010/wordprocessingGroup" xmlns:wpi="http://schemas.microsoft.com/office/word/2010/wordprocessingInk" xmlns:wps="http://schemas.microsoft.com/office/word/2010/wordprocessingShape" xmlns:o="urn:schemas-microsoft-com:office:office" xmlns:v="urn:schemas-microsoft-com:vml" xmlns:w10="urn:schemas-microsoft-com:office:word" xmlns:w="http://schemas.openxmlformats.org/wordprocessingml/2006/main" xmlns:w14="http://schemas.microsoft.com/office/word/2010/wordml" xmlns:w15="http://schemas.microsoft.com/office/word/2012/wordml" xmlns:w16cei="http://schemas.microsoft.com/office/word/2026/wordml/cei" xmlns:w16cex="http://schemas.microsoft.com/office/word/2018/wordml/cex" xmlns:w16cid="http://schemas.microsoft.com/office/word/2016/wordml/cid" xmlns:w16="http://schemas.microsoft.com/office/word/2018/wordml" xmlns:w16sdtdh="http://schemas.microsoft.com/office/word/2020/wordml/sdtdatahash" xmlns:w16sdtfl="http://schemas.microsoft.com/office/word/2024/wordml/sdtformatlock" xmlns:w16se="http://schemas.microsoft.com/office/word/2015/wordml/symex" xmlns:w16du="http://schemas.microsoft.com/office/word/2023/wordml/word16du" xmlns:wne="http://schemas.microsoft.com/office/word/2006/wordml" mc:Ignorable="w14 w15 w16se w16cid w16 w16cex w16sdtdh w16sdtfl w16du wp14">
   <w:sdt>
     <w:sdtPr>
       <w:id w:val="-578296614"/>
@@ -9046,7 +9259,7 @@
 </file>
 
 <file path=word/footnotes.xml><?xml version="1.0" encoding="utf-8"?>
-<w:footnotes xmlns:wpc="http://schemas.microsoft.com/office/word/2010/wordprocessingCanvas" xmlns:cx="http://schemas.microsoft.com/office/drawing/2014/chartex" xmlns:cx1="http://schemas.microsoft.com/office/drawing/2015/9/8/chartex" xmlns:cx2="http://schemas.microsoft.com/office/drawing/2015/10/21/chartex" xmlns:cx3="http://schemas.microsoft.com/office/drawing/2016/5/9/chartex" xmlns:cx4="http://schemas.microsoft.com/office/drawing/2016/5/10/chartex" xmlns:cx5="http://schemas.microsoft.com/office/drawing/2016/5/11/chartex" xmlns:cx6="http://schemas.microsoft.com/office/drawing/2016/5/12/chartex" xmlns:cx7="http://schemas.microsoft.com/office/drawing/2016/5/13/chartex" xmlns:cx8="http://schemas.microsoft.com/office/drawing/2016/5/14/chartex" xmlns:mc="http://schemas.openxmlformats.org/markup-compatibility/2006" xmlns:aink="http://schemas.microsoft.com/office/drawing/2016/ink" xmlns:am3d="http://schemas.microsoft.com/office/drawing/2017/model3d" xmlns:o="urn:schemas-microsoft-com:office:office" xmlns:oel="http://schemas.microsoft.com/office/2019/extlst" xmlns:r="http://schemas.openxmlformats.org/officeDocument/2006/relationships" xmlns:m="http://schemas.openxmlformats.org/officeDocument/2006/math" xmlns:v="urn:schemas-microsoft-com:vml" xmlns:wp14="http://schemas.microsoft.com/office/word/2010/wordprocessingDrawing" xmlns:wp="http://schemas.openxmlformats.org/drawingml/2006/wordprocessingDrawing" xmlns:w10="urn:schemas-microsoft-com:office:word" xmlns:w="http://schemas.openxmlformats.org/wordprocessingml/2006/main" xmlns:w14="http://schemas.microsoft.com/office/word/2010/wordml" xmlns:w15="http://schemas.microsoft.com/office/word/2012/wordml" xmlns:w16cex="http://schemas.microsoft.com/office/word/2018/wordml/cex" xmlns:w16cid="http://schemas.microsoft.com/office/word/2016/wordml/cid" xmlns:w16="http://schemas.microsoft.com/office/word/2018/wordml" xmlns:w16du="http://schemas.microsoft.com/office/word/2023/wordml/word16du" xmlns:w16sdtdh="http://schemas.microsoft.com/office/word/2020/wordml/sdtdatahash" xmlns:w16sdtfl="http://schemas.microsoft.com/office/word/2024/wordml/sdtformatlock" xmlns:w16se="http://schemas.microsoft.com/office/word/2015/wordml/symex" xmlns:wpg="http://schemas.microsoft.com/office/word/2010/wordprocessingGroup" xmlns:wpi="http://schemas.microsoft.com/office/word/2010/wordprocessingInk" xmlns:wne="http://schemas.microsoft.com/office/word/2006/wordml" xmlns:wps="http://schemas.microsoft.com/office/word/2010/wordprocessingShape" mc:Ignorable="w14 w15 w16se w16cid w16 w16cex w16sdtdh w16sdtfl w16du wp14">
+<w:footnotes xmlns:wpc="http://schemas.microsoft.com/office/word/2010/wordprocessingCanvas" xmlns:cx="http://schemas.microsoft.com/office/drawing/2014/chartex" xmlns:cx1="http://schemas.microsoft.com/office/drawing/2015/9/8/chartex" xmlns:cx2="http://schemas.microsoft.com/office/drawing/2015/10/21/chartex" xmlns:cx3="http://schemas.microsoft.com/office/drawing/2016/5/9/chartex" xmlns:cx4="http://schemas.microsoft.com/office/drawing/2016/5/10/chartex" xmlns:cx5="http://schemas.microsoft.com/office/drawing/2016/5/11/chartex" xmlns:cx6="http://schemas.microsoft.com/office/drawing/2016/5/12/chartex" xmlns:cx7="http://schemas.microsoft.com/office/drawing/2016/5/13/chartex" xmlns:cx8="http://schemas.microsoft.com/office/drawing/2016/5/14/chartex" xmlns:mc="http://schemas.openxmlformats.org/markup-compatibility/2006" xmlns:m="http://schemas.openxmlformats.org/officeDocument/2006/math" xmlns:aink="http://schemas.microsoft.com/office/drawing/2016/ink" xmlns:am3d="http://schemas.microsoft.com/office/drawing/2017/model3d" xmlns:oel="http://schemas.microsoft.com/office/2019/extlst" xmlns:r="http://schemas.openxmlformats.org/officeDocument/2006/relationships" xmlns:wp14="http://schemas.microsoft.com/office/word/2010/wordprocessingDrawing" xmlns:wp="http://schemas.openxmlformats.org/drawingml/2006/wordprocessingDrawing" xmlns:wpg="http://schemas.microsoft.com/office/word/2010/wordprocessingGroup" xmlns:wpi="http://schemas.microsoft.com/office/word/2010/wordprocessingInk" xmlns:wps="http://schemas.microsoft.com/office/word/2010/wordprocessingShape" xmlns:o="urn:schemas-microsoft-com:office:office" xmlns:v="urn:schemas-microsoft-com:vml" xmlns:w10="urn:schemas-microsoft-com:office:word" xmlns:w="http://schemas.openxmlformats.org/wordprocessingml/2006/main" xmlns:w14="http://schemas.microsoft.com/office/word/2010/wordml" xmlns:w15="http://schemas.microsoft.com/office/word/2012/wordml" xmlns:w16cei="http://schemas.microsoft.com/office/word/2026/wordml/cei" xmlns:w16cex="http://schemas.microsoft.com/office/word/2018/wordml/cex" xmlns:w16cid="http://schemas.microsoft.com/office/word/2016/wordml/cid" xmlns:w16="http://schemas.microsoft.com/office/word/2018/wordml" xmlns:w16sdtdh="http://schemas.microsoft.com/office/word/2020/wordml/sdtdatahash" xmlns:w16sdtfl="http://schemas.microsoft.com/office/word/2024/wordml/sdtformatlock" xmlns:w16se="http://schemas.microsoft.com/office/word/2015/wordml/symex" xmlns:w16du="http://schemas.microsoft.com/office/word/2023/wordml/word16du" xmlns:wne="http://schemas.microsoft.com/office/word/2006/wordml" mc:Ignorable="w14 w15 w16se w16cid w16 w16cex w16sdtdh w16sdtfl w16du wp14">
   <w:footnote w:type="separator" w:id="-1">
     <w:p>
       <w:r>
@@ -9065,7 +9278,7 @@
 </file>
 
 <file path=word/header1.xml><?xml version="1.0" encoding="utf-8"?>
-<w:hdr xmlns:wpc="http://schemas.microsoft.com/office/word/2010/wordprocessingCanvas" xmlns:cx="http://schemas.microsoft.com/office/drawing/2014/chartex" xmlns:cx1="http://schemas.microsoft.com/office/drawing/2015/9/8/chartex" xmlns:cx2="http://schemas.microsoft.com/office/drawing/2015/10/21/chartex" xmlns:cx3="http://schemas.microsoft.com/office/drawing/2016/5/9/chartex" xmlns:cx4="http://schemas.microsoft.com/office/drawing/2016/5/10/chartex" xmlns:cx5="http://schemas.microsoft.com/office/drawing/2016/5/11/chartex" xmlns:cx6="http://schemas.microsoft.com/office/drawing/2016/5/12/chartex" xmlns:cx7="http://schemas.microsoft.com/office/drawing/2016/5/13/chartex" xmlns:cx8="http://schemas.microsoft.com/office/drawing/2016/5/14/chartex" xmlns:mc="http://schemas.openxmlformats.org/markup-compatibility/2006" xmlns:aink="http://schemas.microsoft.com/office/drawing/2016/ink" xmlns:am3d="http://schemas.microsoft.com/office/drawing/2017/model3d" xmlns:o="urn:schemas-microsoft-com:office:office" xmlns:oel="http://schemas.microsoft.com/office/2019/extlst" xmlns:r="http://schemas.openxmlformats.org/officeDocument/2006/relationships" xmlns:m="http://schemas.openxmlformats.org/officeDocument/2006/math" xmlns:v="urn:schemas-microsoft-com:vml" xmlns:wp14="http://schemas.microsoft.com/office/word/2010/wordprocessingDrawing" xmlns:wp="http://schemas.openxmlformats.org/drawingml/2006/wordprocessingDrawing" xmlns:w10="urn:schemas-microsoft-com:office:word" xmlns:w="http://schemas.openxmlformats.org/wordprocessingml/2006/main" xmlns:w14="http://schemas.microsoft.com/office/word/2010/wordml" xmlns:w15="http://schemas.microsoft.com/office/word/2012/wordml" xmlns:w16cex="http://schemas.microsoft.com/office/word/2018/wordml/cex" xmlns:w16cid="http://schemas.microsoft.com/office/word/2016/wordml/cid" xmlns:w16="http://schemas.microsoft.com/office/word/2018/wordml" xmlns:w16du="http://schemas.microsoft.com/office/word/2023/wordml/word16du" xmlns:w16sdtdh="http://schemas.microsoft.com/office/word/2020/wordml/sdtdatahash" xmlns:w16sdtfl="http://schemas.microsoft.com/office/word/2024/wordml/sdtformatlock" xmlns:w16se="http://schemas.microsoft.com/office/word/2015/wordml/symex" xmlns:wpg="http://schemas.microsoft.com/office/word/2010/wordprocessingGroup" xmlns:wpi="http://schemas.microsoft.com/office/word/2010/wordprocessingInk" xmlns:wne="http://schemas.microsoft.com/office/word/2006/wordml" xmlns:wps="http://schemas.microsoft.com/office/word/2010/wordprocessingShape" mc:Ignorable="w14 w15 w16se w16cid w16 w16cex w16sdtdh w16sdtfl w16du wp14">
+<w:hdr xmlns:wpc="http://schemas.microsoft.com/office/word/2010/wordprocessingCanvas" xmlns:cx="http://schemas.microsoft.com/office/drawing/2014/chartex" xmlns:cx1="http://schemas.microsoft.com/office/drawing/2015/9/8/chartex" xmlns:cx2="http://schemas.microsoft.com/office/drawing/2015/10/21/chartex" xmlns:cx3="http://schemas.microsoft.com/office/drawing/2016/5/9/chartex" xmlns:cx4="http://schemas.microsoft.com/office/drawing/2016/5/10/chartex" xmlns:cx5="http://schemas.microsoft.com/office/drawing/2016/5/11/chartex" xmlns:cx6="http://schemas.microsoft.com/office/drawing/2016/5/12/chartex" xmlns:cx7="http://schemas.microsoft.com/office/drawing/2016/5/13/chartex" xmlns:cx8="http://schemas.microsoft.com/office/drawing/2016/5/14/chartex" xmlns:mc="http://schemas.openxmlformats.org/markup-compatibility/2006" xmlns:m="http://schemas.openxmlformats.org/officeDocument/2006/math" xmlns:aink="http://schemas.microsoft.com/office/drawing/2016/ink" xmlns:am3d="http://schemas.microsoft.com/office/drawing/2017/model3d" xmlns:oel="http://schemas.microsoft.com/office/2019/extlst" xmlns:r="http://schemas.openxmlformats.org/officeDocument/2006/relationships" xmlns:wp14="http://schemas.microsoft.com/office/word/2010/wordprocessingDrawing" xmlns:wp="http://schemas.openxmlformats.org/drawingml/2006/wordprocessingDrawing" xmlns:wpg="http://schemas.microsoft.com/office/word/2010/wordprocessingGroup" xmlns:wpi="http://schemas.microsoft.com/office/word/2010/wordprocessingInk" xmlns:wps="http://schemas.microsoft.com/office/word/2010/wordprocessingShape" xmlns:o="urn:schemas-microsoft-com:office:office" xmlns:v="urn:schemas-microsoft-com:vml" xmlns:w10="urn:schemas-microsoft-com:office:word" xmlns:w="http://schemas.openxmlformats.org/wordprocessingml/2006/main" xmlns:w14="http://schemas.microsoft.com/office/word/2010/wordml" xmlns:w15="http://schemas.microsoft.com/office/word/2012/wordml" xmlns:w16cei="http://schemas.microsoft.com/office/word/2026/wordml/cei" xmlns:w16cex="http://schemas.microsoft.com/office/word/2018/wordml/cex" xmlns:w16cid="http://schemas.microsoft.com/office/word/2016/wordml/cid" xmlns:w16="http://schemas.microsoft.com/office/word/2018/wordml" xmlns:w16sdtdh="http://schemas.microsoft.com/office/word/2020/wordml/sdtdatahash" xmlns:w16sdtfl="http://schemas.microsoft.com/office/word/2024/wordml/sdtformatlock" xmlns:w16se="http://schemas.microsoft.com/office/word/2015/wordml/symex" xmlns:w16du="http://schemas.microsoft.com/office/word/2023/wordml/word16du" xmlns:wne="http://schemas.microsoft.com/office/word/2006/wordml" mc:Ignorable="w14 w15 w16se w16cid w16 w16cex w16sdtdh w16sdtfl w16du wp14">
   <w:p>
     <w:pPr>
       <w:pStyle w:val="Header"/>
@@ -9083,7 +9296,7 @@
 </file>
 
 <file path=word/numbering.xml><?xml version="1.0" encoding="utf-8"?>
-<w:numbering xmlns:wpc="http://schemas.microsoft.com/office/word/2010/wordprocessingCanvas" xmlns:cx="http://schemas.microsoft.com/office/drawing/2014/chartex" xmlns:cx1="http://schemas.microsoft.com/office/drawing/2015/9/8/chartex" xmlns:cx2="http://schemas.microsoft.com/office/drawing/2015/10/21/chartex" xmlns:cx3="http://schemas.microsoft.com/office/drawing/2016/5/9/chartex" xmlns:cx4="http://schemas.microsoft.com/office/drawing/2016/5/10/chartex" xmlns:cx5="http://schemas.microsoft.com/office/drawing/2016/5/11/chartex" xmlns:cx6="http://schemas.microsoft.com/office/drawing/2016/5/12/chartex" xmlns:cx7="http://schemas.microsoft.com/office/drawing/2016/5/13/chartex" xmlns:cx8="http://schemas.microsoft.com/office/drawing/2016/5/14/chartex" xmlns:mc="http://schemas.openxmlformats.org/markup-compatibility/2006" xmlns:aink="http://schemas.microsoft.com/office/drawing/2016/ink" xmlns:am3d="http://schemas.microsoft.com/office/drawing/2017/model3d" xmlns:o="urn:schemas-microsoft-com:office:office" xmlns:oel="http://schemas.microsoft.com/office/2019/extlst" xmlns:r="http://schemas.openxmlformats.org/officeDocument/2006/relationships" xmlns:m="http://schemas.openxmlformats.org/officeDocument/2006/math" xmlns:v="urn:schemas-microsoft-com:vml" xmlns:wp14="http://schemas.microsoft.com/office/word/2010/wordprocessingDrawing" xmlns:wp="http://schemas.openxmlformats.org/drawingml/2006/wordprocessingDrawing" xmlns:w10="urn:schemas-microsoft-com:office:word" xmlns:w="http://schemas.openxmlformats.org/wordprocessingml/2006/main" xmlns:w14="http://schemas.microsoft.com/office/word/2010/wordml" xmlns:w15="http://schemas.microsoft.com/office/word/2012/wordml" xmlns:w16cex="http://schemas.microsoft.com/office/word/2018/wordml/cex" xmlns:w16cid="http://schemas.microsoft.com/office/word/2016/wordml/cid" xmlns:w16="http://schemas.microsoft.com/office/word/2018/wordml" xmlns:w16du="http://schemas.microsoft.com/office/word/2023/wordml/word16du" xmlns:w16sdtdh="http://schemas.microsoft.com/office/word/2020/wordml/sdtdatahash" xmlns:w16sdtfl="http://schemas.microsoft.com/office/word/2024/wordml/sdtformatlock" xmlns:w16se="http://schemas.microsoft.com/office/word/2015/wordml/symex" xmlns:wpg="http://schemas.microsoft.com/office/word/2010/wordprocessingGroup" xmlns:wpi="http://schemas.microsoft.com/office/word/2010/wordprocessingInk" xmlns:wne="http://schemas.microsoft.com/office/word/2006/wordml" xmlns:wps="http://schemas.microsoft.com/office/word/2010/wordprocessingShape" mc:Ignorable="w14 w15 w16se w16cid w16 w16cex w16sdtdh w16sdtfl w16du wp14">
+<w:numbering xmlns:wpc="http://schemas.microsoft.com/office/word/2010/wordprocessingCanvas" xmlns:cx="http://schemas.microsoft.com/office/drawing/2014/chartex" xmlns:cx1="http://schemas.microsoft.com/office/drawing/2015/9/8/chartex" xmlns:cx2="http://schemas.microsoft.com/office/drawing/2015/10/21/chartex" xmlns:cx3="http://schemas.microsoft.com/office/drawing/2016/5/9/chartex" xmlns:cx4="http://schemas.microsoft.com/office/drawing/2016/5/10/chartex" xmlns:cx5="http://schemas.microsoft.com/office/drawing/2016/5/11/chartex" xmlns:cx6="http://schemas.microsoft.com/office/drawing/2016/5/12/chartex" xmlns:cx7="http://schemas.microsoft.com/office/drawing/2016/5/13/chartex" xmlns:cx8="http://schemas.microsoft.com/office/drawing/2016/5/14/chartex" xmlns:mc="http://schemas.openxmlformats.org/markup-compatibility/2006" xmlns:m="http://schemas.openxmlformats.org/officeDocument/2006/math" xmlns:aink="http://schemas.microsoft.com/office/drawing/2016/ink" xmlns:am3d="http://schemas.microsoft.com/office/drawing/2017/model3d" xmlns:oel="http://schemas.microsoft.com/office/2019/extlst" xmlns:r="http://schemas.openxmlformats.org/officeDocument/2006/relationships" xmlns:wp14="http://schemas.microsoft.com/office/word/2010/wordprocessingDrawing" xmlns:wp="http://schemas.openxmlformats.org/drawingml/2006/wordprocessingDrawing" xmlns:wpg="http://schemas.microsoft.com/office/word/2010/wordprocessingGroup" xmlns:wpi="http://schemas.microsoft.com/office/word/2010/wordprocessingInk" xmlns:wps="http://schemas.microsoft.com/office/word/2010/wordprocessingShape" xmlns:o="urn:schemas-microsoft-com:office:office" xmlns:v="urn:schemas-microsoft-com:vml" xmlns:w10="urn:schemas-microsoft-com:office:word" xmlns:w="http://schemas.openxmlformats.org/wordprocessingml/2006/main" xmlns:w14="http://schemas.microsoft.com/office/word/2010/wordml" xmlns:w15="http://schemas.microsoft.com/office/word/2012/wordml" xmlns:w16cei="http://schemas.microsoft.com/office/word/2026/wordml/cei" xmlns:w16cex="http://schemas.microsoft.com/office/word/2018/wordml/cex" xmlns:w16cid="http://schemas.microsoft.com/office/word/2016/wordml/cid" xmlns:w16="http://schemas.microsoft.com/office/word/2018/wordml" xmlns:w16sdtdh="http://schemas.microsoft.com/office/word/2020/wordml/sdtdatahash" xmlns:w16sdtfl="http://schemas.microsoft.com/office/word/2024/wordml/sdtformatlock" xmlns:w16se="http://schemas.microsoft.com/office/word/2015/wordml/symex" xmlns:w16du="http://schemas.microsoft.com/office/word/2023/wordml/word16du" xmlns:wne="http://schemas.microsoft.com/office/word/2006/wordml" mc:Ignorable="w14 w15 w16se w16cid w16 w16cex w16sdtdh w16sdtfl w16du wp14">
   <w:abstractNum w:abstractNumId="0" w15:restartNumberingAfterBreak="0">
     <w:nsid w:val="119E1A26"/>
     <w:multiLevelType w:val="hybridMultilevel"/>
@@ -9513,7 +9726,7 @@
 </file>
 
 <file path=word/styles.xml><?xml version="1.0" encoding="utf-8"?>
-<w:styles xmlns:mc="http://schemas.openxmlformats.org/markup-compatibility/2006" xmlns:r="http://schemas.openxmlformats.org/officeDocument/2006/relationships" xmlns:w="http://schemas.openxmlformats.org/wordprocessingml/2006/main" xmlns:w14="http://schemas.microsoft.com/office/word/2010/wordml" xmlns:w15="http://schemas.microsoft.com/office/word/2012/wordml" xmlns:w16cex="http://schemas.microsoft.com/office/word/2018/wordml/cex" xmlns:w16cid="http://schemas.microsoft.com/office/word/2016/wordml/cid" xmlns:w16="http://schemas.microsoft.com/office/word/2018/wordml" xmlns:w16du="http://schemas.microsoft.com/office/word/2023/wordml/word16du" xmlns:w16sdtdh="http://schemas.microsoft.com/office/word/2020/wordml/sdtdatahash" xmlns:w16sdtfl="http://schemas.microsoft.com/office/word/2024/wordml/sdtformatlock" xmlns:w16se="http://schemas.microsoft.com/office/word/2015/wordml/symex" mc:Ignorable="w14 w15 w16se w16cid w16 w16cex w16sdtdh w16sdtfl w16du">
+<w:styles xmlns:mc="http://schemas.openxmlformats.org/markup-compatibility/2006" xmlns:r="http://schemas.openxmlformats.org/officeDocument/2006/relationships" xmlns:w="http://schemas.openxmlformats.org/wordprocessingml/2006/main" xmlns:w14="http://schemas.microsoft.com/office/word/2010/wordml" xmlns:w15="http://schemas.microsoft.com/office/word/2012/wordml" xmlns:w16cex="http://schemas.microsoft.com/office/word/2018/wordml/cex" xmlns:w16cid="http://schemas.microsoft.com/office/word/2016/wordml/cid" xmlns:w16="http://schemas.microsoft.com/office/word/2018/wordml" xmlns:w16sdtdh="http://schemas.microsoft.com/office/word/2020/wordml/sdtdatahash" xmlns:w16sdtfl="http://schemas.microsoft.com/office/word/2024/wordml/sdtformatlock" xmlns:w16se="http://schemas.microsoft.com/office/word/2015/wordml/symex" xmlns:w16du="http://schemas.microsoft.com/office/word/2023/wordml/word16du" mc:Ignorable="w14 w15 w16se w16cid w16 w16cex w16sdtdh w16sdtfl w16du">
   <w:docDefaults>
     <w:rPrDefault>
       <w:rPr>
@@ -11488,11 +11701,112 @@
     <b:Pages>7354</b:Pages>
     <b:RefOrder>17</b:RefOrder>
   </b:Source>
+  <b:Source>
+    <b:Tag>MaS241</b:Tag>
+    <b:SourceType>JournalArticle</b:SourceType>
+    <b:Guid>{7E61B44A-1070-8B4A-95AC-353498748A10}</b:Guid>
+    <b:Author>
+      <b:Author>
+        <b:NameList>
+          <b:Person>
+            <b:Last>Ma</b:Last>
+            <b:First>Shishuang</b:First>
+          </b:Person>
+          <b:Person>
+            <b:Last>Zhang</b:Last>
+            <b:First>Xiaoshuang</b:First>
+          </b:Person>
+        </b:NameList>
+      </b:Author>
+    </b:Author>
+    <b:Title>Integrating blockchain and ZK-Rollup for efficient healthcare data privacy protection system via IPFS</b:Title>
+    <b:JournalName>Scientific Reports</b:JournalName>
+    <b:Year>2024</b:Year>
+    <b:Volume>14</b:Volume>
+    <b:Pages>11746</b:Pages>
+    <b:RefOrder>18</b:RefOrder>
+  </b:Source>
+  <b:Source>
+    <b:Tag>Isl25</b:Tag>
+    <b:SourceType>JournalArticle</b:SourceType>
+    <b:Guid>{314730A9-8101-5242-A167-6EB4DAE95008}</b:Guid>
+    <b:Author>
+      <b:Author>
+        <b:NameList>
+          <b:Person>
+            <b:Last>Islayem</b:Last>
+            <b:First>Radwan</b:First>
+          </b:Person>
+          <b:Person>
+            <b:Last>Gebreab</b:Last>
+            <b:First>Samuel</b:First>
+          </b:Person>
+          <b:Person>
+            <b:Last>AlKhader</b:Last>
+            <b:First>Wasan</b:First>
+          </b:Person>
+          <b:Person>
+            <b:Last>Musamih</b:Last>
+            <b:First>Ahmad</b:First>
+          </b:Person>
+          <b:Person>
+            <b:Last>Salah</b:Last>
+            <b:First>Khaled</b:First>
+          </b:Person>
+          <b:Person>
+            <b:Last>Jayaraman</b:Last>
+            <b:First>Raja</b:First>
+          </b:Person>
+          <b:Person>
+            <b:Last>Khan</b:Last>
+            <b:First>Muhammad</b:First>
+            <b:Middle>Khurram</b:Middle>
+          </b:Person>
+        </b:NameList>
+      </b:Author>
+    </b:Author>
+    <b:Title>Using large language models for enhanced fraud analysis and detection in blockchain based health insurance claims</b:Title>
+    <b:JournalName>Scientific Reports</b:JournalName>
+    <b:Year>2025</b:Year>
+    <b:Volume>15</b:Volume>
+    <b:Pages>29763</b:Pages>
+    <b:RefOrder>19</b:RefOrder>
+  </b:Source>
+  <b:Source>
+    <b:Tag>Sch24</b:Tag>
+    <b:SourceType>JournalArticle</b:SourceType>
+    <b:Guid>{8D70C8C4-1351-A74D-AB54-14F9D8ADB757}</b:Guid>
+    <b:Author>
+      <b:Author>
+        <b:NameList>
+          <b:Person>
+            <b:Last>Schrijver</b:Last>
+            <b:First>Gilian</b:First>
+          </b:Person>
+          <b:Person>
+            <b:Last>Sarmah</b:Last>
+            <b:First>Dipti</b:First>
+            <b:Middle>K.</b:Middle>
+          </b:Person>
+          <b:Person>
+            <b:Last>El-hajj</b:Last>
+            <b:First>Mohammed</b:First>
+          </b:Person>
+        </b:NameList>
+      </b:Author>
+    </b:Author>
+    <b:Title>Automobile insurance fraud detection using data mining: A systematic literature review</b:Title>
+    <b:JournalName>Intelligent Systems with Applications</b:JournalName>
+    <b:Year>2024</b:Year>
+    <b:Volume>21</b:Volume>
+    <b:Pages>200340</b:Pages>
+    <b:RefOrder>20</b:RefOrder>
+  </b:Source>
 </b:Sources>
 </file>
 
 <file path=customXml/itemProps1.xml><?xml version="1.0" encoding="utf-8"?>
-<ds:datastoreItem xmlns:ds="http://schemas.openxmlformats.org/officeDocument/2006/customXml" ds:itemID="{63E6F718-0167-1241-8643-1299A37F70B6}">
+<ds:datastoreItem xmlns:ds="http://schemas.openxmlformats.org/officeDocument/2006/customXml" ds:itemID="{B1CC0772-2149-D14A-85E6-FFFB5750A7B1}">
   <ds:schemaRefs>
     <ds:schemaRef ds:uri="http://schemas.openxmlformats.org/officeDocument/2006/bibliography"/>
   </ds:schemaRefs>

</xml_diff>

<commit_message>
fix gcp gasless image
</commit_message>
<xml_diff>
--- a/docs/Dissertation_Ganesh_oli.docx
+++ b/docs/Dissertation_Ganesh_oli.docx
@@ -579,19 +579,16 @@
       <w:bookmarkStart w:id="9" w:name="_Toc128143290"/>
       <w:r>
         <w:lastRenderedPageBreak/>
+        <w:t xml:space="preserve">Table of </w:t>
+      </w:r>
+      <w:r>
         <w:t>Contents</w:t>
       </w:r>
       <w:bookmarkStart w:id="10" w:name="ToC"/>
       <w:bookmarkEnd w:id="7"/>
-      <w:bookmarkEnd w:id="10"/>
-      <w:r>
-        <w:t xml:space="preserve"> (This is an example)</w:t>
-      </w:r>
       <w:bookmarkEnd w:id="8"/>
       <w:bookmarkEnd w:id="9"/>
-      <w:r>
-        <w:t xml:space="preserve"> </w:t>
-      </w:r>
+      <w:bookmarkEnd w:id="10"/>
     </w:p>
     <w:p>
       <w:pPr>
@@ -1638,7 +1635,19 @@
           <w:rPr>
             <w:rStyle w:val="Hyperlink"/>
           </w:rPr>
-          <w:t>Methodology</w:t>
+          <w:t>M</w:t>
+        </w:r>
+        <w:r>
+          <w:rPr>
+            <w:rStyle w:val="Hyperlink"/>
+          </w:rPr>
+          <w:t>e</w:t>
+        </w:r>
+        <w:r>
+          <w:rPr>
+            <w:rStyle w:val="Hyperlink"/>
+          </w:rPr>
+          <w:t>thodology</w:t>
         </w:r>
         <w:r>
           <w:rPr>

</xml_diff>